<commit_message>
add programFramework for compiles and update linkLinst_ope
</commit_message>
<xml_diff>
--- a/Definition_Files/command_git.docx
+++ b/Definition_Files/command_git.docx
@@ -4,7 +4,7 @@
   <w:body>
     <w:p>
       <w:pPr>
-        <w:pStyle w:val="681"/>
+        <w:pStyle w:val="890"/>
         <w:pBdr/>
         <w:spacing/>
         <w:ind/>
@@ -35,7 +35,7 @@
     </w:p>
     <w:p>
       <w:pPr>
-        <w:pStyle w:val="681"/>
+        <w:pStyle w:val="890"/>
         <w:pBdr/>
         <w:spacing/>
         <w:ind/>
@@ -66,7 +66,7 @@
     </w:p>
     <w:p>
       <w:pPr>
-        <w:pStyle w:val="681"/>
+        <w:pStyle w:val="890"/>
         <w:pBdr/>
         <w:spacing/>
         <w:ind/>
@@ -97,7 +97,7 @@
     </w:p>
     <w:p>
       <w:pPr>
-        <w:pStyle w:val="681"/>
+        <w:pStyle w:val="890"/>
         <w:pBdr/>
         <w:spacing/>
         <w:ind/>
@@ -128,7 +128,7 @@
     </w:p>
     <w:p>
       <w:pPr>
-        <w:pStyle w:val="681"/>
+        <w:pStyle w:val="890"/>
         <w:pBdr/>
         <w:spacing/>
         <w:ind/>
@@ -159,7 +159,7 @@
     </w:p>
     <w:p>
       <w:pPr>
-        <w:pStyle w:val="681"/>
+        <w:pStyle w:val="890"/>
         <w:pBdr/>
         <w:spacing/>
         <w:ind/>
@@ -190,7 +190,7 @@
     </w:p>
     <w:p>
       <w:pPr>
-        <w:pStyle w:val="681"/>
+        <w:pStyle w:val="890"/>
         <w:pBdr/>
         <w:spacing/>
         <w:ind/>
@@ -221,7 +221,7 @@
     </w:p>
     <w:p>
       <w:pPr>
-        <w:pStyle w:val="681"/>
+        <w:pStyle w:val="890"/>
         <w:pBdr/>
         <w:spacing/>
         <w:ind/>
@@ -252,7 +252,7 @@
     </w:p>
     <w:p>
       <w:pPr>
-        <w:pStyle w:val="681"/>
+        <w:pStyle w:val="890"/>
         <w:pBdr/>
         <w:spacing/>
         <w:ind/>
@@ -283,7 +283,7 @@
     </w:p>
     <w:p>
       <w:pPr>
-        <w:pStyle w:val="681"/>
+        <w:pStyle w:val="890"/>
         <w:pBdr/>
         <w:spacing/>
         <w:ind/>
@@ -314,7 +314,7 @@
     </w:p>
     <w:p>
       <w:pPr>
-        <w:pStyle w:val="681"/>
+        <w:pStyle w:val="890"/>
         <w:pBdr/>
         <w:spacing/>
         <w:ind/>
@@ -322,6 +322,11 @@
           <w:rFonts w:hint="eastAsia" w:ascii="AR PL UKai CN" w:hAnsi="AR PL UKai CN" w:eastAsia="AR PL UKai CN" w:cs="AR PL UKai CN"/>
         </w:rPr>
       </w:pPr>
+      <w:r>
+        <w:rPr>
+          <w:rFonts w:hint="eastAsia" w:ascii="AR PL UKai CN" w:hAnsi="AR PL UKai CN" w:eastAsia="AR PL UKai CN" w:cs="AR PL UKai CN"/>
+        </w:rPr>
+      </w:r>
       <w:r>
         <w:rPr>
           <w:rFonts w:hint="eastAsia" w:ascii="AR PL UKai CN" w:hAnsi="AR PL UKai CN" w:eastAsia="AR PL UKai CN" w:cs="AR PL UKai CN"/>
@@ -335,7 +340,7 @@
     </w:p>
     <w:p>
       <w:pPr>
-        <w:pStyle w:val="681"/>
+        <w:pStyle w:val="890"/>
         <w:pBdr/>
         <w:spacing/>
         <w:ind/>
@@ -343,6 +348,11 @@
           <w:rFonts w:hint="eastAsia" w:ascii="AR PL UKai CN" w:hAnsi="AR PL UKai CN" w:eastAsia="AR PL UKai CN" w:cs="AR PL UKai CN"/>
         </w:rPr>
       </w:pPr>
+      <w:r>
+        <w:rPr>
+          <w:rFonts w:hint="eastAsia" w:ascii="AR PL UKai CN" w:hAnsi="AR PL UKai CN" w:eastAsia="AR PL UKai CN" w:cs="AR PL UKai CN"/>
+        </w:rPr>
+      </w:r>
       <w:r>
         <w:rPr>
           <w:rFonts w:hint="eastAsia" w:ascii="AR PL UKai CN" w:hAnsi="AR PL UKai CN" w:eastAsia="AR PL UKai CN" w:cs="AR PL UKai CN"/>
@@ -356,7 +366,7 @@
     </w:p>
     <w:p>
       <w:pPr>
-        <w:pStyle w:val="681"/>
+        <w:pStyle w:val="890"/>
         <w:pBdr/>
         <w:spacing/>
         <w:ind/>
@@ -387,7 +397,7 @@
     </w:p>
     <w:p>
       <w:pPr>
-        <w:pStyle w:val="681"/>
+        <w:pStyle w:val="890"/>
         <w:pBdr/>
         <w:spacing/>
         <w:ind/>
@@ -418,7 +428,7 @@
     </w:p>
     <w:p>
       <w:pPr>
-        <w:pStyle w:val="681"/>
+        <w:pStyle w:val="890"/>
         <w:pBdr/>
         <w:spacing/>
         <w:ind/>
@@ -427,6 +437,12 @@
           <w:lang w:val="en-US" w:eastAsia="zh-CN"/>
         </w:rPr>
       </w:pPr>
+      <w:r>
+        <w:rPr>
+          <w:rFonts w:hint="eastAsia" w:ascii="AR PL UKai CN" w:hAnsi="AR PL UKai CN" w:eastAsia="AR PL UKai CN" w:cs="AR PL UKai CN"/>
+          <w:lang w:val="en-US" w:eastAsia="zh-CN"/>
+        </w:rPr>
+      </w:r>
       <w:r>
         <w:rPr>
           <w:rFonts w:hint="eastAsia" w:ascii="AR PL UKai CN" w:hAnsi="AR PL UKai CN" w:eastAsia="AR PL UKai CN" w:cs="AR PL UKai CN"/>
@@ -442,7 +458,7 @@
     </w:p>
     <w:p>
       <w:pPr>
-        <w:pStyle w:val="681"/>
+        <w:pStyle w:val="890"/>
         <w:pBdr/>
         <w:spacing/>
         <w:ind/>
@@ -473,7 +489,7 @@
     </w:p>
     <w:p>
       <w:pPr>
-        <w:pStyle w:val="681"/>
+        <w:pStyle w:val="890"/>
         <w:pBdr/>
         <w:spacing/>
         <w:ind/>
@@ -493,7 +509,7 @@
       <w:hyperlink r:id="rId8" w:tooltip="http://git@github.com" w:history="1">
         <w:r>
           <w:rPr>
-            <w:rStyle w:val="187"/>
+            <w:rStyle w:val="876"/>
             <w:rFonts w:hint="eastAsia" w:ascii="AR PL UKai CN" w:hAnsi="AR PL UKai CN" w:eastAsia="AR PL UKai CN" w:cs="AR PL UKai CN"/>
             <w:lang w:val="en-US" w:eastAsia="zh-CN"/>
           </w:rPr>
@@ -501,14 +517,14 @@
         </w:r>
         <w:r>
           <w:rPr>
-            <w:rStyle w:val="187"/>
+            <w:rStyle w:val="876"/>
             <w:rFonts w:ascii="AR PL UKai CN" w:hAnsi="AR PL UKai CN" w:eastAsia="AR PL UKai CN" w:cs="AR PL UKai CN"/>
             <w:lang w:val="en-US" w:eastAsia="zh-CN"/>
           </w:rPr>
         </w:r>
         <w:r>
           <w:rPr>
-            <w:rStyle w:val="187"/>
+            <w:rStyle w:val="876"/>
             <w:rFonts w:ascii="AR PL UKai CN" w:hAnsi="AR PL UKai CN" w:eastAsia="AR PL UKai CN" w:cs="AR PL UKai CN"/>
             <w:lang w:val="en-US" w:eastAsia="zh-CN"/>
           </w:rPr>
@@ -520,10 +536,17 @@
           <w:lang w:val="en-US" w:eastAsia="zh-CN"/>
         </w:rPr>
       </w:r>
+      <w:r>
+        <w:rPr>
+          <w:rFonts w:ascii="AR PL UKai CN" w:hAnsi="AR PL UKai CN" w:eastAsia="AR PL UKai CN" w:cs="AR PL UKai CN"/>
+          <w:highlight w:val="none"/>
+          <w:lang w:val="en-US" w:eastAsia="zh-CN"/>
+        </w:rPr>
+      </w:r>
     </w:p>
     <w:p>
       <w:pPr>
-        <w:pStyle w:val="681"/>
+        <w:pStyle w:val="890"/>
         <w:pBdr/>
         <w:spacing/>
         <w:ind/>
@@ -574,7 +597,7 @@
                       <pic:spPr bwMode="auto">
                         <a:xfrm>
                           <a:off x="0" y="0"/>
-                          <a:ext cx="5274309" cy="2569535"/>
+                          <a:ext cx="5274308" cy="2569535"/>
                         </a:xfrm>
                         <a:prstGeom prst="rect">
                           <a:avLst/>
@@ -628,45 +651,18 @@
           <w:lang w:val="en-US" w:eastAsia="zh-CN"/>
         </w:rPr>
       </w:r>
-      <w:r>
+    </w:p>
+    <w:p>
+      <w:pPr>
+        <w:pStyle w:val="890"/>
+        <w:pBdr/>
+        <w:spacing/>
+        <w:ind/>
         <w:rPr>
           <w:rFonts w:ascii="AR PL UKai CN" w:hAnsi="AR PL UKai CN" w:eastAsia="AR PL UKai CN" w:cs="AR PL UKai CN"/>
           <w:lang w:val="en-US" w:eastAsia="zh-CN"/>
         </w:rPr>
-      </w:r>
-    </w:p>
-    <w:p>
-      <w:pPr>
-        <w:pStyle w:val="681"/>
-        <w:pBdr/>
-        <w:spacing/>
-        <w:ind/>
-        <w:rPr>
-          <w:rFonts w:ascii="AR PL UKai CN" w:hAnsi="AR PL UKai CN" w:eastAsia="AR PL UKai CN" w:cs="AR PL UKai CN"/>
-          <w:lang w:val="en-US" w:eastAsia="zh-CN"/>
-        </w:rPr>
-      </w:pPr>
-      <w:r>
-        <w:rPr>
-          <w:rFonts w:ascii="AR PL UKai CN" w:hAnsi="AR PL UKai CN" w:eastAsia="AR PL UKai CN" w:cs="AR PL UKai CN"/>
-          <w:highlight w:val="none"/>
-          <w:lang w:val="en-US" w:eastAsia="zh-CN" w:bidi="en-US"/>
-        </w:rPr>
-      </w:r>
-      <w:r>
-        <w:rPr>
-          <w:rFonts w:ascii="AR PL UKai CN" w:hAnsi="AR PL UKai CN" w:eastAsia="AR PL UKai CN" w:cs="AR PL UKai CN"/>
-          <w:highlight w:val="none"/>
-          <w:lang w:val="en-US" w:eastAsia="zh-CN" w:bidi="en-US"/>
-        </w:rPr>
-      </w:r>
-      <w:r>
-        <w:rPr>
-          <w:rFonts w:ascii="AR PL UKai CN" w:hAnsi="AR PL UKai CN" w:eastAsia="AR PL UKai CN" w:cs="AR PL UKai CN"/>
-          <w:highlight w:val="none"/>
-          <w:lang w:val="en-US" w:eastAsia="zh-CN" w:bidi="en-US"/>
-        </w:rPr>
-      </w:r>
+      </w:pPr>
       <w:r>
         <w:rPr>
           <w:rFonts w:ascii="AR PL UKai CN" w:hAnsi="AR PL UKai CN" w:eastAsia="AR PL UKai CN" w:cs="AR PL UKai CN"/>
@@ -681,10 +677,16 @@
           <w:lang w:val="en-US" w:eastAsia="zh-CN"/>
         </w:rPr>
       </w:r>
+      <w:r>
+        <w:rPr>
+          <w:rFonts w:ascii="AR PL UKai CN" w:hAnsi="AR PL UKai CN" w:eastAsia="AR PL UKai CN" w:cs="AR PL UKai CN"/>
+          <w:lang w:val="en-US" w:eastAsia="zh-CN"/>
+        </w:rPr>
+      </w:r>
     </w:p>
     <w:p>
       <w:pPr>
-        <w:pStyle w:val="681"/>
+        <w:pStyle w:val="890"/>
         <w:pBdr/>
         <w:spacing/>
         <w:ind/>
@@ -693,6 +695,12 @@
           <w:lang w:val="en-US" w:eastAsia="zh-CN"/>
         </w:rPr>
       </w:pPr>
+      <w:r>
+        <w:rPr>
+          <w:rFonts w:hint="eastAsia" w:ascii="AR PL UKai CN" w:hAnsi="AR PL UKai CN" w:eastAsia="AR PL UKai CN" w:cs="AR PL UKai CN"/>
+          <w:lang w:val="en-US" w:eastAsia="zh-CN"/>
+        </w:rPr>
+      </w:r>
       <w:r>
         <w:rPr>
           <w:rFonts w:hint="eastAsia" w:ascii="AR PL UKai CN" w:hAnsi="AR PL UKai CN" w:eastAsia="AR PL UKai CN" w:cs="AR PL UKai CN"/>
@@ -708,7 +716,7 @@
     </w:p>
     <w:p>
       <w:pPr>
-        <w:pStyle w:val="681"/>
+        <w:pStyle w:val="890"/>
         <w:pBdr/>
         <w:spacing/>
         <w:ind/>
@@ -727,6 +735,293 @@
         <w:rPr>
           <w:rFonts w:hint="eastAsia" w:ascii="AR PL UKai CN" w:hAnsi="AR PL UKai CN" w:eastAsia="AR PL UKai CN" w:cs="AR PL UKai CN"/>
           <w:lang w:val="en-US" w:eastAsia="zh-CN"/>
+        </w:rPr>
+      </w:r>
+      <w:r>
+        <w:rPr>
+          <w:rFonts w:hint="eastAsia" w:ascii="AR PL UKai CN" w:hAnsi="AR PL UKai CN" w:eastAsia="AR PL UKai CN" w:cs="AR PL UKai CN"/>
+          <w:lang w:val="en-US" w:eastAsia="zh-CN"/>
+        </w:rPr>
+      </w:r>
+    </w:p>
+    <w:p>
+      <w:pPr>
+        <w:pBdr/>
+        <w:spacing/>
+        <w:ind/>
+        <w:rPr>
+          <w:rFonts w:hint="eastAsia" w:ascii="AR PL UKai CN" w:hAnsi="AR PL UKai CN" w:eastAsia="AR PL UKai CN" w:cs="AR PL UKai CN"/>
+        </w:rPr>
+      </w:pPr>
+      <w:r>
+        <w:rPr>
+          <w:rFonts w:hint="eastAsia" w:ascii="AR PL UKai CN" w:hAnsi="AR PL UKai CN" w:eastAsia="AR PL UKai CN" w:cs="AR PL UKai CN"/>
+        </w:rPr>
+      </w:r>
+      <w:r>
+        <w:rPr>
+          <w:rFonts w:hint="eastAsia" w:ascii="AR PL UKai CN" w:hAnsi="AR PL UKai CN" w:eastAsia="AR PL UKai CN" w:cs="AR PL UKai CN"/>
+        </w:rPr>
+      </w:r>
+    </w:p>
+    <w:p>
+      <w:pPr>
+        <w:pBdr/>
+        <w:spacing/>
+        <w:ind/>
+        <w:rPr>
+          <w:rFonts w:hint="eastAsia" w:ascii="AR PL UKai CN" w:hAnsi="AR PL UKai CN" w:eastAsia="AR PL UKai CN" w:cs="AR PL UKai CN"/>
+        </w:rPr>
+      </w:pPr>
+      <w:r>
+        <w:rPr>
+          <w:rFonts w:hint="eastAsia" w:ascii="AR PL UKai CN" w:hAnsi="AR PL UKai CN" w:eastAsia="AR PL UKai CN" w:cs="AR PL UKai CN"/>
+        </w:rPr>
+      </w:r>
+      <w:r>
+        <w:rPr>
+          <w:rFonts w:hint="eastAsia" w:ascii="AR PL UKai CN" w:hAnsi="AR PL UKai CN" w:eastAsia="AR PL UKai CN" w:cs="AR PL UKai CN"/>
+        </w:rPr>
+      </w:r>
+    </w:p>
+    <w:p>
+      <w:pPr>
+        <w:pBdr>
+          <w:top w:val="none" w:color="000000" w:sz="4" w:space="0"/>
+          <w:left w:val="none" w:color="000000" w:sz="4" w:space="0"/>
+          <w:bottom w:val="none" w:color="000000" w:sz="4" w:space="0"/>
+          <w:right w:val="none" w:color="000000" w:sz="4" w:space="0"/>
+        </w:pBdr>
+        <w:spacing/>
+        <w:ind w:right="0" w:firstLine="0" w:left="0"/>
+        <w:rPr>
+          <w:b/>
+          <w:bCs/>
+          <w:sz w:val="24"/>
+          <w:szCs w:val="24"/>
+        </w:rPr>
+      </w:pPr>
+      <w:r>
+        <w:rPr>
+          <w:rFonts w:ascii="Courier New" w:hAnsi="Courier New" w:eastAsia="Courier New" w:cs="Courier New"/>
+          <w:b/>
+          <w:bCs/>
+          <w:color w:val="000000"/>
+          <w:sz w:val="20"/>
+          <w:highlight w:val="none"/>
+        </w:rPr>
+        <w:t xml:space="preserve">强制从github拉取代码覆盖本地文件的步骤：</w:t>
+      </w:r>
+      <w:r>
+        <w:rPr>
+          <w:rFonts w:ascii="Courier New" w:hAnsi="Courier New" w:eastAsia="Courier New" w:cs="Courier New"/>
+          <w:b/>
+          <w:bCs/>
+          <w:color w:val="000000"/>
+          <w:sz w:val="20"/>
+          <w:highlight w:val="none"/>
+        </w:rPr>
+      </w:r>
+    </w:p>
+    <w:p>
+      <w:pPr>
+        <w:pBdr>
+          <w:top w:val="none" w:color="000000" w:sz="4" w:space="0"/>
+          <w:left w:val="none" w:color="000000" w:sz="4" w:space="0"/>
+          <w:bottom w:val="none" w:color="000000" w:sz="4" w:space="0"/>
+          <w:right w:val="none" w:color="000000" w:sz="4" w:space="0"/>
+        </w:pBdr>
+        <w:spacing/>
+        <w:ind w:right="0" w:firstLine="0" w:left="0"/>
+        <w:rPr>
+          <w:rFonts w:ascii="Courier New" w:hAnsi="Courier New" w:eastAsia="Courier New" w:cs="Courier New"/>
+          <w:color w:val="000000"/>
+          <w:sz w:val="20"/>
+          <w:szCs w:val="20"/>
+          <w:highlight w:val="none"/>
+        </w:rPr>
+      </w:pPr>
+      <w:r>
+        <w:rPr>
+          <w:rFonts w:ascii="Courier New" w:hAnsi="Courier New" w:eastAsia="Courier New" w:cs="Courier New"/>
+          <w:color w:val="000000"/>
+          <w:sz w:val="20"/>
+        </w:rPr>
+        <w:t xml:space="preserve"># 1. 获取远程最新代码信息</w:t>
+      </w:r>
+      <w:r/>
+    </w:p>
+    <w:p>
+      <w:pPr>
+        <w:pBdr>
+          <w:top w:val="none" w:color="000000" w:sz="4" w:space="0"/>
+          <w:left w:val="none" w:color="000000" w:sz="4" w:space="0"/>
+          <w:bottom w:val="none" w:color="000000" w:sz="4" w:space="0"/>
+          <w:right w:val="none" w:color="000000" w:sz="4" w:space="0"/>
+        </w:pBdr>
+        <w:spacing/>
+        <w:ind w:right="0" w:firstLine="0" w:left="0"/>
+        <w:rPr/>
+      </w:pPr>
+      <w:r>
+        <w:rPr>
+          <w:rFonts w:ascii="Courier New" w:hAnsi="Courier New" w:eastAsia="Courier New" w:cs="Courier New"/>
+          <w:color w:val="000000"/>
+          <w:sz w:val="20"/>
+        </w:rPr>
+        <w:t xml:space="preserve">git fetch origin</w:t>
+      </w:r>
+      <w:r/>
+    </w:p>
+    <w:p>
+      <w:pPr>
+        <w:pBdr>
+          <w:top w:val="none" w:color="000000" w:sz="4" w:space="0"/>
+          <w:left w:val="none" w:color="000000" w:sz="4" w:space="0"/>
+          <w:bottom w:val="none" w:color="000000" w:sz="4" w:space="0"/>
+          <w:right w:val="none" w:color="000000" w:sz="4" w:space="0"/>
+        </w:pBdr>
+        <w:spacing/>
+        <w:ind w:right="0" w:firstLine="0" w:left="0"/>
+        <w:rPr/>
+      </w:pPr>
+      <w:r>
+        <w:rPr>
+          <w:sz w:val="24"/>
+        </w:rPr>
+      </w:r>
+      <w:r/>
+    </w:p>
+    <w:p>
+      <w:pPr>
+        <w:pBdr>
+          <w:top w:val="none" w:color="000000" w:sz="4" w:space="0"/>
+          <w:left w:val="none" w:color="000000" w:sz="4" w:space="0"/>
+          <w:bottom w:val="none" w:color="000000" w:sz="4" w:space="0"/>
+          <w:right w:val="none" w:color="000000" w:sz="4" w:space="0"/>
+        </w:pBdr>
+        <w:spacing/>
+        <w:ind w:right="0" w:firstLine="0" w:left="0"/>
+        <w:rPr/>
+      </w:pPr>
+      <w:r>
+        <w:rPr>
+          <w:rFonts w:ascii="Courier New" w:hAnsi="Courier New" w:eastAsia="Courier New" w:cs="Courier New"/>
+          <w:color w:val="000000"/>
+          <w:sz w:val="20"/>
+        </w:rPr>
+        <w:t xml:space="preserve"># 2. 硬重置本地分支，用远程版本覆盖已跟踪文件</w:t>
+      </w:r>
+      <w:r/>
+    </w:p>
+    <w:p>
+      <w:pPr>
+        <w:pBdr>
+          <w:top w:val="none" w:color="000000" w:sz="4" w:space="0"/>
+          <w:left w:val="none" w:color="000000" w:sz="4" w:space="0"/>
+          <w:bottom w:val="none" w:color="000000" w:sz="4" w:space="0"/>
+          <w:right w:val="none" w:color="000000" w:sz="4" w:space="0"/>
+        </w:pBdr>
+        <w:spacing/>
+        <w:ind w:right="0" w:firstLine="0" w:left="0"/>
+        <w:rPr/>
+      </w:pPr>
+      <w:r>
+        <w:rPr>
+          <w:rFonts w:ascii="Courier New" w:hAnsi="Courier New" w:eastAsia="Courier New" w:cs="Courier New"/>
+          <w:color w:val="000000"/>
+          <w:sz w:val="20"/>
+        </w:rPr>
+        <w:t xml:space="preserve">git reset --hard origin/master</w:t>
+      </w:r>
+      <w:r/>
+    </w:p>
+    <w:p>
+      <w:pPr>
+        <w:pBdr>
+          <w:top w:val="none" w:color="000000" w:sz="4" w:space="0"/>
+          <w:left w:val="none" w:color="000000" w:sz="4" w:space="0"/>
+          <w:bottom w:val="none" w:color="000000" w:sz="4" w:space="0"/>
+          <w:right w:val="none" w:color="000000" w:sz="4" w:space="0"/>
+        </w:pBdr>
+        <w:spacing/>
+        <w:ind w:right="0" w:firstLine="0" w:left="0"/>
+        <w:rPr/>
+      </w:pPr>
+      <w:r>
+        <w:rPr>
+          <w:sz w:val="24"/>
+        </w:rPr>
+      </w:r>
+      <w:r/>
+    </w:p>
+    <w:p>
+      <w:pPr>
+        <w:pBdr>
+          <w:top w:val="none" w:color="000000" w:sz="4" w:space="0"/>
+          <w:left w:val="none" w:color="000000" w:sz="4" w:space="0"/>
+          <w:bottom w:val="none" w:color="000000" w:sz="4" w:space="0"/>
+          <w:right w:val="none" w:color="000000" w:sz="4" w:space="0"/>
+        </w:pBdr>
+        <w:spacing/>
+        <w:ind w:right="0" w:firstLine="0" w:left="0"/>
+        <w:rPr/>
+      </w:pPr>
+      <w:r>
+        <w:rPr>
+          <w:rFonts w:ascii="Courier New" w:hAnsi="Courier New" w:eastAsia="Courier New" w:cs="Courier New"/>
+          <w:color w:val="000000"/>
+          <w:sz w:val="20"/>
+        </w:rPr>
+        <w:t xml:space="preserve"># 3. 删除所有未跟踪的新增文件/文件夹（解决 .vscode/settings.json 这类问题）</w:t>
+      </w:r>
+      <w:r/>
+    </w:p>
+    <w:p>
+      <w:pPr>
+        <w:pBdr>
+          <w:top w:val="none" w:color="000000" w:sz="4" w:space="0"/>
+          <w:left w:val="none" w:color="000000" w:sz="4" w:space="0"/>
+          <w:bottom w:val="none" w:color="000000" w:sz="4" w:space="0"/>
+          <w:right w:val="none" w:color="000000" w:sz="4" w:space="0"/>
+        </w:pBdr>
+        <w:spacing/>
+        <w:ind w:right="0" w:firstLine="0" w:left="0"/>
+        <w:rPr/>
+      </w:pPr>
+      <w:r>
+        <w:rPr>
+          <w:rFonts w:ascii="Courier New" w:hAnsi="Courier New" w:eastAsia="Courier New" w:cs="Courier New"/>
+          <w:color w:val="000000"/>
+          <w:sz w:val="20"/>
+        </w:rPr>
+        <w:t xml:space="preserve">git clean -fd</w:t>
+      </w:r>
+      <w:r/>
+    </w:p>
+    <w:p>
+      <w:pPr>
+        <w:pBdr/>
+        <w:spacing/>
+        <w:ind/>
+        <w:rPr>
+          <w:rFonts w:hint="eastAsia" w:ascii="AR PL UKai CN" w:hAnsi="AR PL UKai CN" w:eastAsia="AR PL UKai CN" w:cs="AR PL UKai CN"/>
+        </w:rPr>
+      </w:pPr>
+      <w:r>
+        <w:rPr>
+          <w:sz w:val="24"/>
+        </w:rPr>
+      </w:r>
+      <w:r/>
+      <w:r>
+        <w:rPr>
+          <w:rFonts w:hint="eastAsia" w:ascii="AR PL UKai CN" w:hAnsi="AR PL UKai CN" w:eastAsia="AR PL UKai CN" w:cs="AR PL UKai CN"/>
+        </w:rPr>
+      </w:r>
+      <w:r>
+        <w:rPr>
+          <w:rFonts w:hint="eastAsia" w:ascii="AR PL UKai CN" w:hAnsi="AR PL UKai CN" w:eastAsia="AR PL UKai CN" w:cs="AR PL UKai CN"/>
         </w:rPr>
       </w:r>
     </w:p>
@@ -754,7 +1049,6 @@
         <w:ind/>
         <w:rPr/>
       </w:pPr>
-      <w:r/>
       <w:r>
         <w:separator/>
       </w:r>
@@ -769,7 +1063,6 @@
         <w:ind/>
         <w:rPr/>
       </w:pPr>
-      <w:r/>
       <w:r>
         <w:continuationSeparator/>
       </w:r>
@@ -967,7 +1260,7 @@
     <w:lsdException w:name="Bibliography" w:uiPriority="37"/>
     <w:lsdException w:name="TOC Heading" w:uiPriority="39" w:qFormat="1"/>
   </w:latentStyles>
-  <w:style w:type="table" w:styleId="11" w:default="1">
+  <w:style w:type="table" w:styleId="701" w:default="1">
     <w:name w:val="Normal Table"/>
     <w:uiPriority w:val="99"/>
     <w:semiHidden/>
@@ -1160,9 +1453,9 @@
       </w:tcPr>
     </w:tblStylePr>
   </w:style>
-  <w:style w:type="table" w:styleId="12">
+  <w:style w:type="table" w:styleId="702">
     <w:name w:val="Table Grid"/>
-    <w:basedOn w:val="11"/>
+    <w:basedOn w:val="701"/>
     <w:uiPriority w:val="59"/>
     <w:pPr>
       <w:pBdr/>
@@ -1359,9 +1652,9 @@
       </w:tcPr>
     </w:tblStylePr>
   </w:style>
-  <w:style w:type="table" w:styleId="13">
+  <w:style w:type="table" w:styleId="703">
     <w:name w:val="Table Grid Light"/>
-    <w:basedOn w:val="11"/>
+    <w:basedOn w:val="701"/>
     <w:uiPriority w:val="59"/>
     <w:pPr>
       <w:pBdr/>
@@ -1558,9 +1851,9 @@
       </w:tcPr>
     </w:tblStylePr>
   </w:style>
-  <w:style w:type="table" w:styleId="14">
+  <w:style w:type="table" w:styleId="704">
     <w:name w:val="Plain Table 1"/>
-    <w:basedOn w:val="11"/>
+    <w:basedOn w:val="701"/>
     <w:uiPriority w:val="59"/>
     <w:pPr>
       <w:pBdr/>
@@ -1783,9 +2076,9 @@
       </w:tcPr>
     </w:tblStylePr>
   </w:style>
-  <w:style w:type="table" w:styleId="15">
+  <w:style w:type="table" w:styleId="705">
     <w:name w:val="Plain Table 2"/>
-    <w:basedOn w:val="11"/>
+    <w:basedOn w:val="701"/>
     <w:uiPriority w:val="59"/>
     <w:pPr>
       <w:pBdr/>
@@ -2016,9 +2309,9 @@
       </w:tcPr>
     </w:tblStylePr>
   </w:style>
-  <w:style w:type="table" w:styleId="16">
+  <w:style w:type="table" w:styleId="706">
     <w:name w:val="Plain Table 3"/>
-    <w:basedOn w:val="11"/>
+    <w:basedOn w:val="701"/>
     <w:uiPriority w:val="99"/>
     <w:pPr>
       <w:pBdr/>
@@ -2246,9 +2539,9 @@
       </w:tcPr>
     </w:tblStylePr>
   </w:style>
-  <w:style w:type="table" w:styleId="17">
+  <w:style w:type="table" w:styleId="707">
     <w:name w:val="Plain Table 4"/>
-    <w:basedOn w:val="11"/>
+    <w:basedOn w:val="701"/>
     <w:uiPriority w:val="99"/>
     <w:pPr>
       <w:pBdr/>
@@ -2462,9 +2755,9 @@
       </w:tcPr>
     </w:tblStylePr>
   </w:style>
-  <w:style w:type="table" w:styleId="18">
+  <w:style w:type="table" w:styleId="708">
     <w:name w:val="Plain Table 5"/>
-    <w:basedOn w:val="11"/>
+    <w:basedOn w:val="701"/>
     <w:uiPriority w:val="99"/>
     <w:pPr>
       <w:pBdr/>
@@ -2695,9 +2988,9 @@
       </w:tcPr>
     </w:tblStylePr>
   </w:style>
-  <w:style w:type="table" w:styleId="19">
+  <w:style w:type="table" w:styleId="709">
     <w:name w:val="Grid Table 1 Light"/>
-    <w:basedOn w:val="11"/>
+    <w:basedOn w:val="701"/>
     <w:uiPriority w:val="99"/>
     <w:pPr>
       <w:pBdr/>
@@ -2918,9 +3211,9 @@
       </w:tcPr>
     </w:tblStylePr>
   </w:style>
-  <w:style w:type="table" w:styleId="20">
+  <w:style w:type="table" w:styleId="710">
     <w:name w:val="Grid Table 1 Light - Accent 1"/>
-    <w:basedOn w:val="11"/>
+    <w:basedOn w:val="701"/>
     <w:uiPriority w:val="99"/>
     <w:pPr>
       <w:pBdr/>
@@ -3141,9 +3434,9 @@
       </w:tcPr>
     </w:tblStylePr>
   </w:style>
-  <w:style w:type="table" w:styleId="21">
+  <w:style w:type="table" w:styleId="711">
     <w:name w:val="Grid Table 1 Light - Accent 2"/>
-    <w:basedOn w:val="11"/>
+    <w:basedOn w:val="701"/>
     <w:uiPriority w:val="99"/>
     <w:pPr>
       <w:pBdr/>
@@ -3364,9 +3657,9 @@
       </w:tcPr>
     </w:tblStylePr>
   </w:style>
-  <w:style w:type="table" w:styleId="22">
+  <w:style w:type="table" w:styleId="712">
     <w:name w:val="Grid Table 1 Light - Accent 3"/>
-    <w:basedOn w:val="11"/>
+    <w:basedOn w:val="701"/>
     <w:uiPriority w:val="99"/>
     <w:pPr>
       <w:pBdr/>
@@ -3587,9 +3880,9 @@
       </w:tcPr>
     </w:tblStylePr>
   </w:style>
-  <w:style w:type="table" w:styleId="23">
+  <w:style w:type="table" w:styleId="713">
     <w:name w:val="Grid Table 1 Light - Accent 4"/>
-    <w:basedOn w:val="11"/>
+    <w:basedOn w:val="701"/>
     <w:uiPriority w:val="99"/>
     <w:pPr>
       <w:pBdr/>
@@ -3810,9 +4103,9 @@
       </w:tcPr>
     </w:tblStylePr>
   </w:style>
-  <w:style w:type="table" w:styleId="24">
+  <w:style w:type="table" w:styleId="714">
     <w:name w:val="Grid Table 1 Light - Accent 5"/>
-    <w:basedOn w:val="11"/>
+    <w:basedOn w:val="701"/>
     <w:uiPriority w:val="99"/>
     <w:pPr>
       <w:pBdr/>
@@ -4033,9 +4326,9 @@
       </w:tcPr>
     </w:tblStylePr>
   </w:style>
-  <w:style w:type="table" w:styleId="25">
+  <w:style w:type="table" w:styleId="715">
     <w:name w:val="Grid Table 1 Light - Accent 6"/>
-    <w:basedOn w:val="11"/>
+    <w:basedOn w:val="701"/>
     <w:uiPriority w:val="99"/>
     <w:pPr>
       <w:pBdr/>
@@ -4256,9 +4549,9 @@
       </w:tcPr>
     </w:tblStylePr>
   </w:style>
-  <w:style w:type="table" w:styleId="26">
+  <w:style w:type="table" w:styleId="716">
     <w:name w:val="Grid Table 2"/>
-    <w:basedOn w:val="11"/>
+    <w:basedOn w:val="701"/>
     <w:uiPriority w:val="99"/>
     <w:pPr>
       <w:pBdr/>
@@ -4488,9 +4781,9 @@
       </w:tcPr>
     </w:tblStylePr>
   </w:style>
-  <w:style w:type="table" w:styleId="27">
+  <w:style w:type="table" w:styleId="717">
     <w:name w:val="Grid Table 2 - Accent 1"/>
-    <w:basedOn w:val="11"/>
+    <w:basedOn w:val="701"/>
     <w:uiPriority w:val="99"/>
     <w:pPr>
       <w:pBdr/>
@@ -4720,9 +5013,9 @@
       </w:tcPr>
     </w:tblStylePr>
   </w:style>
-  <w:style w:type="table" w:styleId="28">
+  <w:style w:type="table" w:styleId="718">
     <w:name w:val="Grid Table 2 - Accent 2"/>
-    <w:basedOn w:val="11"/>
+    <w:basedOn w:val="701"/>
     <w:uiPriority w:val="99"/>
     <w:pPr>
       <w:pBdr/>
@@ -4952,9 +5245,9 @@
       </w:tcPr>
     </w:tblStylePr>
   </w:style>
-  <w:style w:type="table" w:styleId="29">
+  <w:style w:type="table" w:styleId="719">
     <w:name w:val="Grid Table 2 - Accent 3"/>
-    <w:basedOn w:val="11"/>
+    <w:basedOn w:val="701"/>
     <w:uiPriority w:val="99"/>
     <w:pPr>
       <w:pBdr/>
@@ -5184,9 +5477,9 @@
       </w:tcPr>
     </w:tblStylePr>
   </w:style>
-  <w:style w:type="table" w:styleId="30">
+  <w:style w:type="table" w:styleId="720">
     <w:name w:val="Grid Table 2 - Accent 4"/>
-    <w:basedOn w:val="11"/>
+    <w:basedOn w:val="701"/>
     <w:uiPriority w:val="99"/>
     <w:pPr>
       <w:pBdr/>
@@ -5416,9 +5709,9 @@
       </w:tcPr>
     </w:tblStylePr>
   </w:style>
-  <w:style w:type="table" w:styleId="31">
+  <w:style w:type="table" w:styleId="721">
     <w:name w:val="Grid Table 2 - Accent 5"/>
-    <w:basedOn w:val="11"/>
+    <w:basedOn w:val="701"/>
     <w:uiPriority w:val="99"/>
     <w:pPr>
       <w:pBdr/>
@@ -5648,9 +5941,9 @@
       </w:tcPr>
     </w:tblStylePr>
   </w:style>
-  <w:style w:type="table" w:styleId="32">
+  <w:style w:type="table" w:styleId="722">
     <w:name w:val="Grid Table 2 - Accent 6"/>
-    <w:basedOn w:val="11"/>
+    <w:basedOn w:val="701"/>
     <w:uiPriority w:val="99"/>
     <w:pPr>
       <w:pBdr/>
@@ -5880,9 +6173,9 @@
       </w:tcPr>
     </w:tblStylePr>
   </w:style>
-  <w:style w:type="table" w:styleId="33">
+  <w:style w:type="table" w:styleId="723">
     <w:name w:val="Grid Table 3"/>
-    <w:basedOn w:val="11"/>
+    <w:basedOn w:val="701"/>
     <w:uiPriority w:val="99"/>
     <w:pPr>
       <w:pBdr/>
@@ -5981,29 +6274,6 @@
         <w:tblBorders/>
       </w:tblPr>
       <w:tcPr>
-        <w:shd w:color="ffffff"/>
-        <w:tcBorders>
-          <w:top w:val="none" w:color="000000" w:sz="4" w:space="0"/>
-          <w:left w:val="none" w:color="000000" w:sz="4" w:space="0"/>
-          <w:bottom w:val="none" w:color="000000" w:sz="4" w:space="0"/>
-          <w:right w:val="none" w:color="000000" w:sz="4" w:space="0"/>
-        </w:tcBorders>
-      </w:tcPr>
-    </w:tblStylePr>
-    <w:tblStylePr w:type="firstRow">
-      <w:rPr>
-        <w:b/>
-        <w:color w:val="404040"/>
-      </w:rPr>
-      <w:pPr>
-        <w:pBdr/>
-        <w:spacing/>
-        <w:ind/>
-      </w:pPr>
-      <w:tblPr>
-        <w:tblBorders/>
-      </w:tblPr>
-      <w:tcPr>
         <w:shd w:val="clear" w:color="ffffff"/>
         <w:tcBorders>
           <w:top w:val="none" w:color="000000" w:sz="4" w:space="0"/>
@@ -6013,30 +6283,7 @@
         </w:tcBorders>
       </w:tcPr>
     </w:tblStylePr>
-    <w:tblStylePr w:type="lastCol">
-      <w:rPr>
-        <w:i/>
-        <w:color w:val="404040"/>
-      </w:rPr>
-      <w:pPr>
-        <w:pBdr/>
-        <w:spacing/>
-        <w:ind/>
-      </w:pPr>
-      <w:tblPr>
-        <w:tblBorders/>
-      </w:tblPr>
-      <w:tcPr>
-        <w:shd w:color="ffffff"/>
-        <w:tcBorders>
-          <w:top w:val="none" w:color="000000" w:sz="4" w:space="0"/>
-          <w:left w:val="none" w:color="000000" w:sz="4" w:space="0"/>
-          <w:bottom w:val="none" w:color="000000" w:sz="4" w:space="0"/>
-          <w:right w:val="none" w:color="000000" w:sz="4" w:space="0"/>
-        </w:tcBorders>
-      </w:tcPr>
-    </w:tblStylePr>
-    <w:tblStylePr w:type="lastRow">
+    <w:tblStylePr w:type="firstRow">
       <w:rPr>
         <w:b/>
         <w:color w:val="404040"/>
@@ -6059,6 +6306,52 @@
         </w:tcBorders>
       </w:tcPr>
     </w:tblStylePr>
+    <w:tblStylePr w:type="lastCol">
+      <w:rPr>
+        <w:i/>
+        <w:color w:val="404040"/>
+      </w:rPr>
+      <w:pPr>
+        <w:pBdr/>
+        <w:spacing/>
+        <w:ind/>
+      </w:pPr>
+      <w:tblPr>
+        <w:tblBorders/>
+      </w:tblPr>
+      <w:tcPr>
+        <w:shd w:val="clear" w:color="ffffff"/>
+        <w:tcBorders>
+          <w:top w:val="none" w:color="000000" w:sz="4" w:space="0"/>
+          <w:left w:val="none" w:color="000000" w:sz="4" w:space="0"/>
+          <w:bottom w:val="none" w:color="000000" w:sz="4" w:space="0"/>
+          <w:right w:val="none" w:color="000000" w:sz="4" w:space="0"/>
+        </w:tcBorders>
+      </w:tcPr>
+    </w:tblStylePr>
+    <w:tblStylePr w:type="lastRow">
+      <w:rPr>
+        <w:b/>
+        <w:color w:val="404040"/>
+      </w:rPr>
+      <w:pPr>
+        <w:pBdr/>
+        <w:spacing/>
+        <w:ind/>
+      </w:pPr>
+      <w:tblPr>
+        <w:tblBorders/>
+      </w:tblPr>
+      <w:tcPr>
+        <w:shd w:val="clear" w:color="ffffff"/>
+        <w:tcBorders>
+          <w:top w:val="none" w:color="000000" w:sz="4" w:space="0"/>
+          <w:left w:val="none" w:color="000000" w:sz="4" w:space="0"/>
+          <w:bottom w:val="none" w:color="000000" w:sz="4" w:space="0"/>
+          <w:right w:val="none" w:color="000000" w:sz="4" w:space="0"/>
+        </w:tcBorders>
+      </w:tcPr>
+    </w:tblStylePr>
     <w:tblStylePr w:type="nwCell">
       <w:pPr>
         <w:pBdr/>
@@ -6125,9 +6418,9 @@
       </w:tcPr>
     </w:tblStylePr>
   </w:style>
-  <w:style w:type="table" w:styleId="34">
+  <w:style w:type="table" w:styleId="724">
     <w:name w:val="Grid Table 3 - Accent 1"/>
-    <w:basedOn w:val="11"/>
+    <w:basedOn w:val="701"/>
     <w:uiPriority w:val="99"/>
     <w:pPr>
       <w:pBdr/>
@@ -6226,29 +6519,6 @@
         <w:tblBorders/>
       </w:tblPr>
       <w:tcPr>
-        <w:shd w:color="ffffff"/>
-        <w:tcBorders>
-          <w:top w:val="none" w:color="000000" w:sz="4" w:space="0"/>
-          <w:left w:val="none" w:color="000000" w:sz="4" w:space="0"/>
-          <w:bottom w:val="none" w:color="000000" w:sz="4" w:space="0"/>
-          <w:right w:val="none" w:color="000000" w:sz="4" w:space="0"/>
-        </w:tcBorders>
-      </w:tcPr>
-    </w:tblStylePr>
-    <w:tblStylePr w:type="firstRow">
-      <w:rPr>
-        <w:b/>
-        <w:color w:val="404040"/>
-      </w:rPr>
-      <w:pPr>
-        <w:pBdr/>
-        <w:spacing/>
-        <w:ind/>
-      </w:pPr>
-      <w:tblPr>
-        <w:tblBorders/>
-      </w:tblPr>
-      <w:tcPr>
         <w:shd w:val="clear" w:color="ffffff"/>
         <w:tcBorders>
           <w:top w:val="none" w:color="000000" w:sz="4" w:space="0"/>
@@ -6258,30 +6528,7 @@
         </w:tcBorders>
       </w:tcPr>
     </w:tblStylePr>
-    <w:tblStylePr w:type="lastCol">
-      <w:rPr>
-        <w:i/>
-        <w:color w:val="404040"/>
-      </w:rPr>
-      <w:pPr>
-        <w:pBdr/>
-        <w:spacing/>
-        <w:ind/>
-      </w:pPr>
-      <w:tblPr>
-        <w:tblBorders/>
-      </w:tblPr>
-      <w:tcPr>
-        <w:shd w:color="ffffff"/>
-        <w:tcBorders>
-          <w:top w:val="none" w:color="000000" w:sz="4" w:space="0"/>
-          <w:left w:val="none" w:color="000000" w:sz="4" w:space="0"/>
-          <w:bottom w:val="none" w:color="000000" w:sz="4" w:space="0"/>
-          <w:right w:val="none" w:color="000000" w:sz="4" w:space="0"/>
-        </w:tcBorders>
-      </w:tcPr>
-    </w:tblStylePr>
-    <w:tblStylePr w:type="lastRow">
+    <w:tblStylePr w:type="firstRow">
       <w:rPr>
         <w:b/>
         <w:color w:val="404040"/>
@@ -6304,6 +6551,52 @@
         </w:tcBorders>
       </w:tcPr>
     </w:tblStylePr>
+    <w:tblStylePr w:type="lastCol">
+      <w:rPr>
+        <w:i/>
+        <w:color w:val="404040"/>
+      </w:rPr>
+      <w:pPr>
+        <w:pBdr/>
+        <w:spacing/>
+        <w:ind/>
+      </w:pPr>
+      <w:tblPr>
+        <w:tblBorders/>
+      </w:tblPr>
+      <w:tcPr>
+        <w:shd w:val="clear" w:color="ffffff"/>
+        <w:tcBorders>
+          <w:top w:val="none" w:color="000000" w:sz="4" w:space="0"/>
+          <w:left w:val="none" w:color="000000" w:sz="4" w:space="0"/>
+          <w:bottom w:val="none" w:color="000000" w:sz="4" w:space="0"/>
+          <w:right w:val="none" w:color="000000" w:sz="4" w:space="0"/>
+        </w:tcBorders>
+      </w:tcPr>
+    </w:tblStylePr>
+    <w:tblStylePr w:type="lastRow">
+      <w:rPr>
+        <w:b/>
+        <w:color w:val="404040"/>
+      </w:rPr>
+      <w:pPr>
+        <w:pBdr/>
+        <w:spacing/>
+        <w:ind/>
+      </w:pPr>
+      <w:tblPr>
+        <w:tblBorders/>
+      </w:tblPr>
+      <w:tcPr>
+        <w:shd w:val="clear" w:color="ffffff"/>
+        <w:tcBorders>
+          <w:top w:val="none" w:color="000000" w:sz="4" w:space="0"/>
+          <w:left w:val="none" w:color="000000" w:sz="4" w:space="0"/>
+          <w:bottom w:val="none" w:color="000000" w:sz="4" w:space="0"/>
+          <w:right w:val="none" w:color="000000" w:sz="4" w:space="0"/>
+        </w:tcBorders>
+      </w:tcPr>
+    </w:tblStylePr>
     <w:tblStylePr w:type="nwCell">
       <w:pPr>
         <w:pBdr/>
@@ -6370,9 +6663,9 @@
       </w:tcPr>
     </w:tblStylePr>
   </w:style>
-  <w:style w:type="table" w:styleId="35">
+  <w:style w:type="table" w:styleId="725">
     <w:name w:val="Grid Table 3 - Accent 2"/>
-    <w:basedOn w:val="11"/>
+    <w:basedOn w:val="701"/>
     <w:uiPriority w:val="99"/>
     <w:pPr>
       <w:pBdr/>
@@ -6471,29 +6764,6 @@
         <w:tblBorders/>
       </w:tblPr>
       <w:tcPr>
-        <w:shd w:color="ffffff"/>
-        <w:tcBorders>
-          <w:top w:val="none" w:color="000000" w:sz="4" w:space="0"/>
-          <w:left w:val="none" w:color="000000" w:sz="4" w:space="0"/>
-          <w:bottom w:val="none" w:color="000000" w:sz="4" w:space="0"/>
-          <w:right w:val="none" w:color="000000" w:sz="4" w:space="0"/>
-        </w:tcBorders>
-      </w:tcPr>
-    </w:tblStylePr>
-    <w:tblStylePr w:type="firstRow">
-      <w:rPr>
-        <w:b/>
-        <w:color w:val="404040"/>
-      </w:rPr>
-      <w:pPr>
-        <w:pBdr/>
-        <w:spacing/>
-        <w:ind/>
-      </w:pPr>
-      <w:tblPr>
-        <w:tblBorders/>
-      </w:tblPr>
-      <w:tcPr>
         <w:shd w:val="clear" w:color="ffffff"/>
         <w:tcBorders>
           <w:top w:val="none" w:color="000000" w:sz="4" w:space="0"/>
@@ -6503,30 +6773,7 @@
         </w:tcBorders>
       </w:tcPr>
     </w:tblStylePr>
-    <w:tblStylePr w:type="lastCol">
-      <w:rPr>
-        <w:i/>
-        <w:color w:val="404040"/>
-      </w:rPr>
-      <w:pPr>
-        <w:pBdr/>
-        <w:spacing/>
-        <w:ind/>
-      </w:pPr>
-      <w:tblPr>
-        <w:tblBorders/>
-      </w:tblPr>
-      <w:tcPr>
-        <w:shd w:color="ffffff"/>
-        <w:tcBorders>
-          <w:top w:val="none" w:color="000000" w:sz="4" w:space="0"/>
-          <w:left w:val="none" w:color="000000" w:sz="4" w:space="0"/>
-          <w:bottom w:val="none" w:color="000000" w:sz="4" w:space="0"/>
-          <w:right w:val="none" w:color="000000" w:sz="4" w:space="0"/>
-        </w:tcBorders>
-      </w:tcPr>
-    </w:tblStylePr>
-    <w:tblStylePr w:type="lastRow">
+    <w:tblStylePr w:type="firstRow">
       <w:rPr>
         <w:b/>
         <w:color w:val="404040"/>
@@ -6549,6 +6796,52 @@
         </w:tcBorders>
       </w:tcPr>
     </w:tblStylePr>
+    <w:tblStylePr w:type="lastCol">
+      <w:rPr>
+        <w:i/>
+        <w:color w:val="404040"/>
+      </w:rPr>
+      <w:pPr>
+        <w:pBdr/>
+        <w:spacing/>
+        <w:ind/>
+      </w:pPr>
+      <w:tblPr>
+        <w:tblBorders/>
+      </w:tblPr>
+      <w:tcPr>
+        <w:shd w:val="clear" w:color="ffffff"/>
+        <w:tcBorders>
+          <w:top w:val="none" w:color="000000" w:sz="4" w:space="0"/>
+          <w:left w:val="none" w:color="000000" w:sz="4" w:space="0"/>
+          <w:bottom w:val="none" w:color="000000" w:sz="4" w:space="0"/>
+          <w:right w:val="none" w:color="000000" w:sz="4" w:space="0"/>
+        </w:tcBorders>
+      </w:tcPr>
+    </w:tblStylePr>
+    <w:tblStylePr w:type="lastRow">
+      <w:rPr>
+        <w:b/>
+        <w:color w:val="404040"/>
+      </w:rPr>
+      <w:pPr>
+        <w:pBdr/>
+        <w:spacing/>
+        <w:ind/>
+      </w:pPr>
+      <w:tblPr>
+        <w:tblBorders/>
+      </w:tblPr>
+      <w:tcPr>
+        <w:shd w:val="clear" w:color="ffffff"/>
+        <w:tcBorders>
+          <w:top w:val="none" w:color="000000" w:sz="4" w:space="0"/>
+          <w:left w:val="none" w:color="000000" w:sz="4" w:space="0"/>
+          <w:bottom w:val="none" w:color="000000" w:sz="4" w:space="0"/>
+          <w:right w:val="none" w:color="000000" w:sz="4" w:space="0"/>
+        </w:tcBorders>
+      </w:tcPr>
+    </w:tblStylePr>
     <w:tblStylePr w:type="nwCell">
       <w:pPr>
         <w:pBdr/>
@@ -6615,9 +6908,9 @@
       </w:tcPr>
     </w:tblStylePr>
   </w:style>
-  <w:style w:type="table" w:styleId="36">
+  <w:style w:type="table" w:styleId="726">
     <w:name w:val="Grid Table 3 - Accent 3"/>
-    <w:basedOn w:val="11"/>
+    <w:basedOn w:val="701"/>
     <w:uiPriority w:val="99"/>
     <w:pPr>
       <w:pBdr/>
@@ -6716,29 +7009,6 @@
         <w:tblBorders/>
       </w:tblPr>
       <w:tcPr>
-        <w:shd w:color="ffffff"/>
-        <w:tcBorders>
-          <w:top w:val="none" w:color="000000" w:sz="4" w:space="0"/>
-          <w:left w:val="none" w:color="000000" w:sz="4" w:space="0"/>
-          <w:bottom w:val="none" w:color="000000" w:sz="4" w:space="0"/>
-          <w:right w:val="none" w:color="000000" w:sz="4" w:space="0"/>
-        </w:tcBorders>
-      </w:tcPr>
-    </w:tblStylePr>
-    <w:tblStylePr w:type="firstRow">
-      <w:rPr>
-        <w:b/>
-        <w:color w:val="404040"/>
-      </w:rPr>
-      <w:pPr>
-        <w:pBdr/>
-        <w:spacing/>
-        <w:ind/>
-      </w:pPr>
-      <w:tblPr>
-        <w:tblBorders/>
-      </w:tblPr>
-      <w:tcPr>
         <w:shd w:val="clear" w:color="ffffff"/>
         <w:tcBorders>
           <w:top w:val="none" w:color="000000" w:sz="4" w:space="0"/>
@@ -6748,30 +7018,7 @@
         </w:tcBorders>
       </w:tcPr>
     </w:tblStylePr>
-    <w:tblStylePr w:type="lastCol">
-      <w:rPr>
-        <w:i/>
-        <w:color w:val="404040"/>
-      </w:rPr>
-      <w:pPr>
-        <w:pBdr/>
-        <w:spacing/>
-        <w:ind/>
-      </w:pPr>
-      <w:tblPr>
-        <w:tblBorders/>
-      </w:tblPr>
-      <w:tcPr>
-        <w:shd w:color="ffffff"/>
-        <w:tcBorders>
-          <w:top w:val="none" w:color="000000" w:sz="4" w:space="0"/>
-          <w:left w:val="none" w:color="000000" w:sz="4" w:space="0"/>
-          <w:bottom w:val="none" w:color="000000" w:sz="4" w:space="0"/>
-          <w:right w:val="none" w:color="000000" w:sz="4" w:space="0"/>
-        </w:tcBorders>
-      </w:tcPr>
-    </w:tblStylePr>
-    <w:tblStylePr w:type="lastRow">
+    <w:tblStylePr w:type="firstRow">
       <w:rPr>
         <w:b/>
         <w:color w:val="404040"/>
@@ -6794,6 +7041,52 @@
         </w:tcBorders>
       </w:tcPr>
     </w:tblStylePr>
+    <w:tblStylePr w:type="lastCol">
+      <w:rPr>
+        <w:i/>
+        <w:color w:val="404040"/>
+      </w:rPr>
+      <w:pPr>
+        <w:pBdr/>
+        <w:spacing/>
+        <w:ind/>
+      </w:pPr>
+      <w:tblPr>
+        <w:tblBorders/>
+      </w:tblPr>
+      <w:tcPr>
+        <w:shd w:val="clear" w:color="ffffff"/>
+        <w:tcBorders>
+          <w:top w:val="none" w:color="000000" w:sz="4" w:space="0"/>
+          <w:left w:val="none" w:color="000000" w:sz="4" w:space="0"/>
+          <w:bottom w:val="none" w:color="000000" w:sz="4" w:space="0"/>
+          <w:right w:val="none" w:color="000000" w:sz="4" w:space="0"/>
+        </w:tcBorders>
+      </w:tcPr>
+    </w:tblStylePr>
+    <w:tblStylePr w:type="lastRow">
+      <w:rPr>
+        <w:b/>
+        <w:color w:val="404040"/>
+      </w:rPr>
+      <w:pPr>
+        <w:pBdr/>
+        <w:spacing/>
+        <w:ind/>
+      </w:pPr>
+      <w:tblPr>
+        <w:tblBorders/>
+      </w:tblPr>
+      <w:tcPr>
+        <w:shd w:val="clear" w:color="ffffff"/>
+        <w:tcBorders>
+          <w:top w:val="none" w:color="000000" w:sz="4" w:space="0"/>
+          <w:left w:val="none" w:color="000000" w:sz="4" w:space="0"/>
+          <w:bottom w:val="none" w:color="000000" w:sz="4" w:space="0"/>
+          <w:right w:val="none" w:color="000000" w:sz="4" w:space="0"/>
+        </w:tcBorders>
+      </w:tcPr>
+    </w:tblStylePr>
     <w:tblStylePr w:type="nwCell">
       <w:pPr>
         <w:pBdr/>
@@ -6860,9 +7153,9 @@
       </w:tcPr>
     </w:tblStylePr>
   </w:style>
-  <w:style w:type="table" w:styleId="37">
+  <w:style w:type="table" w:styleId="727">
     <w:name w:val="Grid Table 3 - Accent 4"/>
-    <w:basedOn w:val="11"/>
+    <w:basedOn w:val="701"/>
     <w:uiPriority w:val="99"/>
     <w:pPr>
       <w:pBdr/>
@@ -6961,29 +7254,6 @@
         <w:tblBorders/>
       </w:tblPr>
       <w:tcPr>
-        <w:shd w:color="ffffff"/>
-        <w:tcBorders>
-          <w:top w:val="none" w:color="000000" w:sz="4" w:space="0"/>
-          <w:left w:val="none" w:color="000000" w:sz="4" w:space="0"/>
-          <w:bottom w:val="none" w:color="000000" w:sz="4" w:space="0"/>
-          <w:right w:val="none" w:color="000000" w:sz="4" w:space="0"/>
-        </w:tcBorders>
-      </w:tcPr>
-    </w:tblStylePr>
-    <w:tblStylePr w:type="firstRow">
-      <w:rPr>
-        <w:b/>
-        <w:color w:val="404040"/>
-      </w:rPr>
-      <w:pPr>
-        <w:pBdr/>
-        <w:spacing/>
-        <w:ind/>
-      </w:pPr>
-      <w:tblPr>
-        <w:tblBorders/>
-      </w:tblPr>
-      <w:tcPr>
         <w:shd w:val="clear" w:color="ffffff"/>
         <w:tcBorders>
           <w:top w:val="none" w:color="000000" w:sz="4" w:space="0"/>
@@ -6993,30 +7263,7 @@
         </w:tcBorders>
       </w:tcPr>
     </w:tblStylePr>
-    <w:tblStylePr w:type="lastCol">
-      <w:rPr>
-        <w:i/>
-        <w:color w:val="404040"/>
-      </w:rPr>
-      <w:pPr>
-        <w:pBdr/>
-        <w:spacing/>
-        <w:ind/>
-      </w:pPr>
-      <w:tblPr>
-        <w:tblBorders/>
-      </w:tblPr>
-      <w:tcPr>
-        <w:shd w:color="ffffff"/>
-        <w:tcBorders>
-          <w:top w:val="none" w:color="000000" w:sz="4" w:space="0"/>
-          <w:left w:val="none" w:color="000000" w:sz="4" w:space="0"/>
-          <w:bottom w:val="none" w:color="000000" w:sz="4" w:space="0"/>
-          <w:right w:val="none" w:color="000000" w:sz="4" w:space="0"/>
-        </w:tcBorders>
-      </w:tcPr>
-    </w:tblStylePr>
-    <w:tblStylePr w:type="lastRow">
+    <w:tblStylePr w:type="firstRow">
       <w:rPr>
         <w:b/>
         <w:color w:val="404040"/>
@@ -7039,6 +7286,52 @@
         </w:tcBorders>
       </w:tcPr>
     </w:tblStylePr>
+    <w:tblStylePr w:type="lastCol">
+      <w:rPr>
+        <w:i/>
+        <w:color w:val="404040"/>
+      </w:rPr>
+      <w:pPr>
+        <w:pBdr/>
+        <w:spacing/>
+        <w:ind/>
+      </w:pPr>
+      <w:tblPr>
+        <w:tblBorders/>
+      </w:tblPr>
+      <w:tcPr>
+        <w:shd w:val="clear" w:color="ffffff"/>
+        <w:tcBorders>
+          <w:top w:val="none" w:color="000000" w:sz="4" w:space="0"/>
+          <w:left w:val="none" w:color="000000" w:sz="4" w:space="0"/>
+          <w:bottom w:val="none" w:color="000000" w:sz="4" w:space="0"/>
+          <w:right w:val="none" w:color="000000" w:sz="4" w:space="0"/>
+        </w:tcBorders>
+      </w:tcPr>
+    </w:tblStylePr>
+    <w:tblStylePr w:type="lastRow">
+      <w:rPr>
+        <w:b/>
+        <w:color w:val="404040"/>
+      </w:rPr>
+      <w:pPr>
+        <w:pBdr/>
+        <w:spacing/>
+        <w:ind/>
+      </w:pPr>
+      <w:tblPr>
+        <w:tblBorders/>
+      </w:tblPr>
+      <w:tcPr>
+        <w:shd w:val="clear" w:color="ffffff"/>
+        <w:tcBorders>
+          <w:top w:val="none" w:color="000000" w:sz="4" w:space="0"/>
+          <w:left w:val="none" w:color="000000" w:sz="4" w:space="0"/>
+          <w:bottom w:val="none" w:color="000000" w:sz="4" w:space="0"/>
+          <w:right w:val="none" w:color="000000" w:sz="4" w:space="0"/>
+        </w:tcBorders>
+      </w:tcPr>
+    </w:tblStylePr>
     <w:tblStylePr w:type="nwCell">
       <w:pPr>
         <w:pBdr/>
@@ -7105,9 +7398,9 @@
       </w:tcPr>
     </w:tblStylePr>
   </w:style>
-  <w:style w:type="table" w:styleId="38">
+  <w:style w:type="table" w:styleId="728">
     <w:name w:val="Grid Table 3 - Accent 5"/>
-    <w:basedOn w:val="11"/>
+    <w:basedOn w:val="701"/>
     <w:uiPriority w:val="99"/>
     <w:pPr>
       <w:pBdr/>
@@ -7206,29 +7499,6 @@
         <w:tblBorders/>
       </w:tblPr>
       <w:tcPr>
-        <w:shd w:color="ffffff"/>
-        <w:tcBorders>
-          <w:top w:val="none" w:color="000000" w:sz="4" w:space="0"/>
-          <w:left w:val="none" w:color="000000" w:sz="4" w:space="0"/>
-          <w:bottom w:val="none" w:color="000000" w:sz="4" w:space="0"/>
-          <w:right w:val="none" w:color="000000" w:sz="4" w:space="0"/>
-        </w:tcBorders>
-      </w:tcPr>
-    </w:tblStylePr>
-    <w:tblStylePr w:type="firstRow">
-      <w:rPr>
-        <w:b/>
-        <w:color w:val="404040"/>
-      </w:rPr>
-      <w:pPr>
-        <w:pBdr/>
-        <w:spacing/>
-        <w:ind/>
-      </w:pPr>
-      <w:tblPr>
-        <w:tblBorders/>
-      </w:tblPr>
-      <w:tcPr>
         <w:shd w:val="clear" w:color="ffffff"/>
         <w:tcBorders>
           <w:top w:val="none" w:color="000000" w:sz="4" w:space="0"/>
@@ -7238,30 +7508,7 @@
         </w:tcBorders>
       </w:tcPr>
     </w:tblStylePr>
-    <w:tblStylePr w:type="lastCol">
-      <w:rPr>
-        <w:i/>
-        <w:color w:val="404040"/>
-      </w:rPr>
-      <w:pPr>
-        <w:pBdr/>
-        <w:spacing/>
-        <w:ind/>
-      </w:pPr>
-      <w:tblPr>
-        <w:tblBorders/>
-      </w:tblPr>
-      <w:tcPr>
-        <w:shd w:color="ffffff"/>
-        <w:tcBorders>
-          <w:top w:val="none" w:color="000000" w:sz="4" w:space="0"/>
-          <w:left w:val="none" w:color="000000" w:sz="4" w:space="0"/>
-          <w:bottom w:val="none" w:color="000000" w:sz="4" w:space="0"/>
-          <w:right w:val="none" w:color="000000" w:sz="4" w:space="0"/>
-        </w:tcBorders>
-      </w:tcPr>
-    </w:tblStylePr>
-    <w:tblStylePr w:type="lastRow">
+    <w:tblStylePr w:type="firstRow">
       <w:rPr>
         <w:b/>
         <w:color w:val="404040"/>
@@ -7284,6 +7531,52 @@
         </w:tcBorders>
       </w:tcPr>
     </w:tblStylePr>
+    <w:tblStylePr w:type="lastCol">
+      <w:rPr>
+        <w:i/>
+        <w:color w:val="404040"/>
+      </w:rPr>
+      <w:pPr>
+        <w:pBdr/>
+        <w:spacing/>
+        <w:ind/>
+      </w:pPr>
+      <w:tblPr>
+        <w:tblBorders/>
+      </w:tblPr>
+      <w:tcPr>
+        <w:shd w:val="clear" w:color="ffffff"/>
+        <w:tcBorders>
+          <w:top w:val="none" w:color="000000" w:sz="4" w:space="0"/>
+          <w:left w:val="none" w:color="000000" w:sz="4" w:space="0"/>
+          <w:bottom w:val="none" w:color="000000" w:sz="4" w:space="0"/>
+          <w:right w:val="none" w:color="000000" w:sz="4" w:space="0"/>
+        </w:tcBorders>
+      </w:tcPr>
+    </w:tblStylePr>
+    <w:tblStylePr w:type="lastRow">
+      <w:rPr>
+        <w:b/>
+        <w:color w:val="404040"/>
+      </w:rPr>
+      <w:pPr>
+        <w:pBdr/>
+        <w:spacing/>
+        <w:ind/>
+      </w:pPr>
+      <w:tblPr>
+        <w:tblBorders/>
+      </w:tblPr>
+      <w:tcPr>
+        <w:shd w:val="clear" w:color="ffffff"/>
+        <w:tcBorders>
+          <w:top w:val="none" w:color="000000" w:sz="4" w:space="0"/>
+          <w:left w:val="none" w:color="000000" w:sz="4" w:space="0"/>
+          <w:bottom w:val="none" w:color="000000" w:sz="4" w:space="0"/>
+          <w:right w:val="none" w:color="000000" w:sz="4" w:space="0"/>
+        </w:tcBorders>
+      </w:tcPr>
+    </w:tblStylePr>
     <w:tblStylePr w:type="nwCell">
       <w:pPr>
         <w:pBdr/>
@@ -7350,9 +7643,9 @@
       </w:tcPr>
     </w:tblStylePr>
   </w:style>
-  <w:style w:type="table" w:styleId="39">
+  <w:style w:type="table" w:styleId="729">
     <w:name w:val="Grid Table 3 - Accent 6"/>
-    <w:basedOn w:val="11"/>
+    <w:basedOn w:val="701"/>
     <w:uiPriority w:val="99"/>
     <w:pPr>
       <w:pBdr/>
@@ -7451,29 +7744,6 @@
         <w:tblBorders/>
       </w:tblPr>
       <w:tcPr>
-        <w:shd w:color="ffffff"/>
-        <w:tcBorders>
-          <w:top w:val="none" w:color="000000" w:sz="4" w:space="0"/>
-          <w:left w:val="none" w:color="000000" w:sz="4" w:space="0"/>
-          <w:bottom w:val="none" w:color="000000" w:sz="4" w:space="0"/>
-          <w:right w:val="none" w:color="000000" w:sz="4" w:space="0"/>
-        </w:tcBorders>
-      </w:tcPr>
-    </w:tblStylePr>
-    <w:tblStylePr w:type="firstRow">
-      <w:rPr>
-        <w:b/>
-        <w:color w:val="404040"/>
-      </w:rPr>
-      <w:pPr>
-        <w:pBdr/>
-        <w:spacing/>
-        <w:ind/>
-      </w:pPr>
-      <w:tblPr>
-        <w:tblBorders/>
-      </w:tblPr>
-      <w:tcPr>
         <w:shd w:val="clear" w:color="ffffff"/>
         <w:tcBorders>
           <w:top w:val="none" w:color="000000" w:sz="4" w:space="0"/>
@@ -7483,30 +7753,7 @@
         </w:tcBorders>
       </w:tcPr>
     </w:tblStylePr>
-    <w:tblStylePr w:type="lastCol">
-      <w:rPr>
-        <w:i/>
-        <w:color w:val="404040"/>
-      </w:rPr>
-      <w:pPr>
-        <w:pBdr/>
-        <w:spacing/>
-        <w:ind/>
-      </w:pPr>
-      <w:tblPr>
-        <w:tblBorders/>
-      </w:tblPr>
-      <w:tcPr>
-        <w:shd w:color="ffffff"/>
-        <w:tcBorders>
-          <w:top w:val="none" w:color="000000" w:sz="4" w:space="0"/>
-          <w:left w:val="none" w:color="000000" w:sz="4" w:space="0"/>
-          <w:bottom w:val="none" w:color="000000" w:sz="4" w:space="0"/>
-          <w:right w:val="none" w:color="000000" w:sz="4" w:space="0"/>
-        </w:tcBorders>
-      </w:tcPr>
-    </w:tblStylePr>
-    <w:tblStylePr w:type="lastRow">
+    <w:tblStylePr w:type="firstRow">
       <w:rPr>
         <w:b/>
         <w:color w:val="404040"/>
@@ -7529,6 +7776,52 @@
         </w:tcBorders>
       </w:tcPr>
     </w:tblStylePr>
+    <w:tblStylePr w:type="lastCol">
+      <w:rPr>
+        <w:i/>
+        <w:color w:val="404040"/>
+      </w:rPr>
+      <w:pPr>
+        <w:pBdr/>
+        <w:spacing/>
+        <w:ind/>
+      </w:pPr>
+      <w:tblPr>
+        <w:tblBorders/>
+      </w:tblPr>
+      <w:tcPr>
+        <w:shd w:val="clear" w:color="ffffff"/>
+        <w:tcBorders>
+          <w:top w:val="none" w:color="000000" w:sz="4" w:space="0"/>
+          <w:left w:val="none" w:color="000000" w:sz="4" w:space="0"/>
+          <w:bottom w:val="none" w:color="000000" w:sz="4" w:space="0"/>
+          <w:right w:val="none" w:color="000000" w:sz="4" w:space="0"/>
+        </w:tcBorders>
+      </w:tcPr>
+    </w:tblStylePr>
+    <w:tblStylePr w:type="lastRow">
+      <w:rPr>
+        <w:b/>
+        <w:color w:val="404040"/>
+      </w:rPr>
+      <w:pPr>
+        <w:pBdr/>
+        <w:spacing/>
+        <w:ind/>
+      </w:pPr>
+      <w:tblPr>
+        <w:tblBorders/>
+      </w:tblPr>
+      <w:tcPr>
+        <w:shd w:val="clear" w:color="ffffff"/>
+        <w:tcBorders>
+          <w:top w:val="none" w:color="000000" w:sz="4" w:space="0"/>
+          <w:left w:val="none" w:color="000000" w:sz="4" w:space="0"/>
+          <w:bottom w:val="none" w:color="000000" w:sz="4" w:space="0"/>
+          <w:right w:val="none" w:color="000000" w:sz="4" w:space="0"/>
+        </w:tcBorders>
+      </w:tcPr>
+    </w:tblStylePr>
     <w:tblStylePr w:type="nwCell">
       <w:pPr>
         <w:pBdr/>
@@ -7595,9 +7888,9 @@
       </w:tcPr>
     </w:tblStylePr>
   </w:style>
-  <w:style w:type="table" w:styleId="40">
+  <w:style w:type="table" w:styleId="730">
     <w:name w:val="Grid Table 4"/>
-    <w:basedOn w:val="11"/>
+    <w:basedOn w:val="701"/>
     <w:uiPriority w:val="59"/>
     <w:pPr>
       <w:pBdr/>
@@ -7828,9 +8121,9 @@
       </w:tcPr>
     </w:tblStylePr>
   </w:style>
-  <w:style w:type="table" w:styleId="41">
+  <w:style w:type="table" w:styleId="731">
     <w:name w:val="Grid Table 4 - Accent 1"/>
-    <w:basedOn w:val="11"/>
+    <w:basedOn w:val="701"/>
     <w:uiPriority w:val="59"/>
     <w:pPr>
       <w:pBdr/>
@@ -8061,9 +8354,9 @@
       </w:tcPr>
     </w:tblStylePr>
   </w:style>
-  <w:style w:type="table" w:styleId="42">
+  <w:style w:type="table" w:styleId="732">
     <w:name w:val="Grid Table 4 - Accent 2"/>
-    <w:basedOn w:val="11"/>
+    <w:basedOn w:val="701"/>
     <w:uiPriority w:val="59"/>
     <w:pPr>
       <w:pBdr/>
@@ -8294,9 +8587,9 @@
       </w:tcPr>
     </w:tblStylePr>
   </w:style>
-  <w:style w:type="table" w:styleId="43">
+  <w:style w:type="table" w:styleId="733">
     <w:name w:val="Grid Table 4 - Accent 3"/>
-    <w:basedOn w:val="11"/>
+    <w:basedOn w:val="701"/>
     <w:uiPriority w:val="59"/>
     <w:pPr>
       <w:pBdr/>
@@ -8527,9 +8820,9 @@
       </w:tcPr>
     </w:tblStylePr>
   </w:style>
-  <w:style w:type="table" w:styleId="44">
+  <w:style w:type="table" w:styleId="734">
     <w:name w:val="Grid Table 4 - Accent 4"/>
-    <w:basedOn w:val="11"/>
+    <w:basedOn w:val="701"/>
     <w:uiPriority w:val="59"/>
     <w:pPr>
       <w:pBdr/>
@@ -8760,9 +9053,9 @@
       </w:tcPr>
     </w:tblStylePr>
   </w:style>
-  <w:style w:type="table" w:styleId="45">
+  <w:style w:type="table" w:styleId="735">
     <w:name w:val="Grid Table 4 - Accent 5"/>
-    <w:basedOn w:val="11"/>
+    <w:basedOn w:val="701"/>
     <w:uiPriority w:val="59"/>
     <w:pPr>
       <w:pBdr/>
@@ -8993,9 +9286,9 @@
       </w:tcPr>
     </w:tblStylePr>
   </w:style>
-  <w:style w:type="table" w:styleId="46">
+  <w:style w:type="table" w:styleId="736">
     <w:name w:val="Grid Table 4 - Accent 6"/>
-    <w:basedOn w:val="11"/>
+    <w:basedOn w:val="701"/>
     <w:uiPriority w:val="59"/>
     <w:pPr>
       <w:pBdr/>
@@ -9226,9 +9519,9 @@
       </w:tcPr>
     </w:tblStylePr>
   </w:style>
-  <w:style w:type="table" w:styleId="47">
+  <w:style w:type="table" w:styleId="737">
     <w:name w:val="Grid Table 5 Dark"/>
-    <w:basedOn w:val="11"/>
+    <w:basedOn w:val="701"/>
     <w:uiPriority w:val="99"/>
     <w:pPr>
       <w:pBdr/>
@@ -9454,9 +9747,9 @@
       </w:tcPr>
     </w:tblStylePr>
   </w:style>
-  <w:style w:type="table" w:styleId="48">
+  <w:style w:type="table" w:styleId="738">
     <w:name w:val="Grid Table 5 Dark- Accent 1"/>
-    <w:basedOn w:val="11"/>
+    <w:basedOn w:val="701"/>
     <w:uiPriority w:val="99"/>
     <w:pPr>
       <w:pBdr/>
@@ -9682,9 +9975,9 @@
       </w:tcPr>
     </w:tblStylePr>
   </w:style>
-  <w:style w:type="table" w:styleId="49">
+  <w:style w:type="table" w:styleId="739">
     <w:name w:val="Grid Table 5 Dark - Accent 2"/>
-    <w:basedOn w:val="11"/>
+    <w:basedOn w:val="701"/>
     <w:uiPriority w:val="99"/>
     <w:pPr>
       <w:pBdr/>
@@ -9910,9 +10203,9 @@
       </w:tcPr>
     </w:tblStylePr>
   </w:style>
-  <w:style w:type="table" w:styleId="50">
+  <w:style w:type="table" w:styleId="740">
     <w:name w:val="Grid Table 5 Dark - Accent 3"/>
-    <w:basedOn w:val="11"/>
+    <w:basedOn w:val="701"/>
     <w:uiPriority w:val="99"/>
     <w:pPr>
       <w:pBdr/>
@@ -10138,9 +10431,9 @@
       </w:tcPr>
     </w:tblStylePr>
   </w:style>
-  <w:style w:type="table" w:styleId="51">
+  <w:style w:type="table" w:styleId="741">
     <w:name w:val="Grid Table 5 Dark- Accent 4"/>
-    <w:basedOn w:val="11"/>
+    <w:basedOn w:val="701"/>
     <w:uiPriority w:val="99"/>
     <w:pPr>
       <w:pBdr/>
@@ -10366,9 +10659,9 @@
       </w:tcPr>
     </w:tblStylePr>
   </w:style>
-  <w:style w:type="table" w:styleId="52">
+  <w:style w:type="table" w:styleId="742">
     <w:name w:val="Grid Table 5 Dark - Accent 5"/>
-    <w:basedOn w:val="11"/>
+    <w:basedOn w:val="701"/>
     <w:uiPriority w:val="99"/>
     <w:pPr>
       <w:pBdr/>
@@ -10594,9 +10887,9 @@
       </w:tcPr>
     </w:tblStylePr>
   </w:style>
-  <w:style w:type="table" w:styleId="53">
+  <w:style w:type="table" w:styleId="743">
     <w:name w:val="Grid Table 5 Dark - Accent 6"/>
-    <w:basedOn w:val="11"/>
+    <w:basedOn w:val="701"/>
     <w:uiPriority w:val="99"/>
     <w:pPr>
       <w:pBdr/>
@@ -10822,9 +11115,9 @@
       </w:tcPr>
     </w:tblStylePr>
   </w:style>
-  <w:style w:type="table" w:styleId="54">
+  <w:style w:type="table" w:styleId="744">
     <w:name w:val="Grid Table 6 Colorful"/>
-    <w:basedOn w:val="11"/>
+    <w:basedOn w:val="701"/>
     <w:uiPriority w:val="99"/>
     <w:pPr>
       <w:pBdr/>
@@ -11052,9 +11345,9 @@
       </w:tcPr>
     </w:tblStylePr>
   </w:style>
-  <w:style w:type="table" w:styleId="55">
+  <w:style w:type="table" w:styleId="745">
     <w:name w:val="Grid Table 6 Colorful - Accent 1"/>
-    <w:basedOn w:val="11"/>
+    <w:basedOn w:val="701"/>
     <w:uiPriority w:val="99"/>
     <w:pPr>
       <w:pBdr/>
@@ -11282,9 +11575,9 @@
       </w:tcPr>
     </w:tblStylePr>
   </w:style>
-  <w:style w:type="table" w:styleId="56">
+  <w:style w:type="table" w:styleId="746">
     <w:name w:val="Grid Table 6 Colorful - Accent 2"/>
-    <w:basedOn w:val="11"/>
+    <w:basedOn w:val="701"/>
     <w:uiPriority w:val="99"/>
     <w:pPr>
       <w:pBdr/>
@@ -11512,9 +11805,9 @@
       </w:tcPr>
     </w:tblStylePr>
   </w:style>
-  <w:style w:type="table" w:styleId="57">
+  <w:style w:type="table" w:styleId="747">
     <w:name w:val="Grid Table 6 Colorful - Accent 3"/>
-    <w:basedOn w:val="11"/>
+    <w:basedOn w:val="701"/>
     <w:uiPriority w:val="99"/>
     <w:pPr>
       <w:pBdr/>
@@ -11742,9 +12035,9 @@
       </w:tcPr>
     </w:tblStylePr>
   </w:style>
-  <w:style w:type="table" w:styleId="58">
+  <w:style w:type="table" w:styleId="748">
     <w:name w:val="Grid Table 6 Colorful - Accent 4"/>
-    <w:basedOn w:val="11"/>
+    <w:basedOn w:val="701"/>
     <w:uiPriority w:val="99"/>
     <w:pPr>
       <w:pBdr/>
@@ -11972,9 +12265,9 @@
       </w:tcPr>
     </w:tblStylePr>
   </w:style>
-  <w:style w:type="table" w:styleId="59">
+  <w:style w:type="table" w:styleId="749">
     <w:name w:val="Grid Table 6 Colorful - Accent 5"/>
-    <w:basedOn w:val="11"/>
+    <w:basedOn w:val="701"/>
     <w:uiPriority w:val="99"/>
     <w:pPr>
       <w:pBdr/>
@@ -12202,9 +12495,9 @@
       </w:tcPr>
     </w:tblStylePr>
   </w:style>
-  <w:style w:type="table" w:styleId="60">
+  <w:style w:type="table" w:styleId="750">
     <w:name w:val="Grid Table 6 Colorful - Accent 6"/>
-    <w:basedOn w:val="11"/>
+    <w:basedOn w:val="701"/>
     <w:uiPriority w:val="99"/>
     <w:pPr>
       <w:pBdr/>
@@ -12432,9 +12725,9 @@
       </w:tcPr>
     </w:tblStylePr>
   </w:style>
-  <w:style w:type="table" w:styleId="61">
+  <w:style w:type="table" w:styleId="751">
     <w:name w:val="Grid Table 7 Colorful"/>
-    <w:basedOn w:val="11"/>
+    <w:basedOn w:val="701"/>
     <w:uiPriority w:val="99"/>
     <w:pPr>
       <w:pBdr/>
@@ -12536,11 +12829,11 @@
         <w:tblBorders/>
       </w:tblPr>
       <w:tcPr>
-        <w:shd w:color="ffffff"/>
+        <w:shd w:val="clear" w:color="ffffff"/>
         <w:tcBorders>
-          <w:top w:val="none"/>
-          <w:left w:val="none"/>
-          <w:bottom w:val="none"/>
+          <w:top w:val="none" w:color="000000" w:sz="4" w:space="0"/>
+          <w:left w:val="none" w:color="000000" w:sz="4" w:space="0"/>
+          <w:bottom w:val="none" w:color="000000" w:sz="4" w:space="0"/>
           <w:right w:val="single" w:color="000000" w:themeColor="text1" w:themeTint="80" w:sz="4" w:space="0"/>
         </w:tcBorders>
       </w:tcPr>
@@ -12563,10 +12856,10 @@
       <w:tcPr>
         <w:shd w:val="clear" w:color="ffffff" w:themeColor="light1" w:fill="ffffff" w:themeFill="light1"/>
         <w:tcBorders>
-          <w:top w:val="none"/>
-          <w:left w:val="none"/>
+          <w:top w:val="none" w:color="000000" w:sz="4" w:space="0"/>
+          <w:left w:val="none" w:color="000000" w:sz="4" w:space="0"/>
           <w:bottom w:val="single" w:color="000000" w:themeColor="text1" w:themeTint="80" w:sz="4" w:space="0"/>
-          <w:right w:val="none"/>
+          <w:right w:val="none" w:color="000000" w:sz="4" w:space="0"/>
         </w:tcBorders>
       </w:tcPr>
     </w:tblStylePr>
@@ -12586,12 +12879,12 @@
         <w:tblBorders/>
       </w:tblPr>
       <w:tcPr>
-        <w:shd w:color="ffffff"/>
+        <w:shd w:val="clear" w:color="ffffff"/>
         <w:tcBorders>
-          <w:top w:val="none"/>
+          <w:top w:val="none" w:color="000000" w:sz="4" w:space="0"/>
           <w:left w:val="single" w:color="000000" w:themeColor="text1" w:themeTint="80" w:sz="4" w:space="0"/>
-          <w:bottom w:val="none"/>
-          <w:right w:val="none"/>
+          <w:bottom w:val="none" w:color="000000" w:sz="4" w:space="0"/>
+          <w:right w:val="none" w:color="000000" w:sz="4" w:space="0"/>
         </w:tcBorders>
       </w:tcPr>
     </w:tblStylePr>
@@ -12614,9 +12907,9 @@
         <w:shd w:val="clear" w:color="ffffff" w:themeColor="light1" w:fill="ffffff" w:themeFill="light1"/>
         <w:tcBorders>
           <w:top w:val="single" w:color="000000" w:themeColor="text1" w:themeTint="80" w:sz="4" w:space="0"/>
-          <w:left w:val="none"/>
-          <w:bottom w:val="none"/>
-          <w:right w:val="none"/>
+          <w:left w:val="none" w:color="000000" w:sz="4" w:space="0"/>
+          <w:bottom w:val="none" w:color="000000" w:sz="4" w:space="0"/>
+          <w:right w:val="none" w:color="000000" w:sz="4" w:space="0"/>
         </w:tcBorders>
       </w:tcPr>
     </w:tblStylePr>
@@ -12686,9 +12979,9 @@
       </w:tcPr>
     </w:tblStylePr>
   </w:style>
-  <w:style w:type="table" w:styleId="62">
+  <w:style w:type="table" w:styleId="752">
     <w:name w:val="Grid Table 7 Colorful - Accent 1"/>
-    <w:basedOn w:val="11"/>
+    <w:basedOn w:val="701"/>
     <w:uiPriority w:val="99"/>
     <w:pPr>
       <w:pBdr/>
@@ -12790,11 +13083,11 @@
         <w:tblBorders/>
       </w:tblPr>
       <w:tcPr>
-        <w:shd w:color="ffffff"/>
+        <w:shd w:val="clear" w:color="ffffff"/>
         <w:tcBorders>
-          <w:top w:val="none"/>
-          <w:left w:val="none"/>
-          <w:bottom w:val="none"/>
+          <w:top w:val="none" w:color="000000" w:sz="4" w:space="0"/>
+          <w:left w:val="none" w:color="000000" w:sz="4" w:space="0"/>
+          <w:bottom w:val="none" w:color="000000" w:sz="4" w:space="0"/>
           <w:right w:val="single" w:color="000000" w:themeColor="accent1" w:themeTint="80" w:sz="4" w:space="0"/>
         </w:tcBorders>
       </w:tcPr>
@@ -12817,10 +13110,10 @@
       <w:tcPr>
         <w:shd w:val="clear" w:color="ffffff" w:themeColor="light1" w:fill="ffffff" w:themeFill="light1"/>
         <w:tcBorders>
-          <w:top w:val="none"/>
-          <w:left w:val="none"/>
+          <w:top w:val="none" w:color="000000" w:sz="4" w:space="0"/>
+          <w:left w:val="none" w:color="000000" w:sz="4" w:space="0"/>
           <w:bottom w:val="single" w:color="000000" w:themeColor="accent1" w:themeTint="80" w:sz="4" w:space="0"/>
-          <w:right w:val="none"/>
+          <w:right w:val="none" w:color="000000" w:sz="4" w:space="0"/>
         </w:tcBorders>
       </w:tcPr>
     </w:tblStylePr>
@@ -12840,12 +13133,12 @@
         <w:tblBorders/>
       </w:tblPr>
       <w:tcPr>
-        <w:shd w:color="ffffff"/>
+        <w:shd w:val="clear" w:color="ffffff"/>
         <w:tcBorders>
-          <w:top w:val="none"/>
+          <w:top w:val="none" w:color="000000" w:sz="4" w:space="0"/>
           <w:left w:val="single" w:color="000000" w:themeColor="accent1" w:themeTint="80" w:sz="4" w:space="0"/>
-          <w:bottom w:val="none"/>
-          <w:right w:val="none"/>
+          <w:bottom w:val="none" w:color="000000" w:sz="4" w:space="0"/>
+          <w:right w:val="none" w:color="000000" w:sz="4" w:space="0"/>
         </w:tcBorders>
       </w:tcPr>
     </w:tblStylePr>
@@ -12868,9 +13161,9 @@
         <w:shd w:val="clear" w:color="ffffff" w:themeColor="light1" w:fill="ffffff" w:themeFill="light1"/>
         <w:tcBorders>
           <w:top w:val="single" w:color="000000" w:themeColor="accent1" w:themeTint="80" w:sz="4" w:space="0"/>
-          <w:left w:val="none"/>
-          <w:bottom w:val="none"/>
-          <w:right w:val="none"/>
+          <w:left w:val="none" w:color="000000" w:sz="4" w:space="0"/>
+          <w:bottom w:val="none" w:color="000000" w:sz="4" w:space="0"/>
+          <w:right w:val="none" w:color="000000" w:sz="4" w:space="0"/>
         </w:tcBorders>
       </w:tcPr>
     </w:tblStylePr>
@@ -12940,9 +13233,9 @@
       </w:tcPr>
     </w:tblStylePr>
   </w:style>
-  <w:style w:type="table" w:styleId="63">
+  <w:style w:type="table" w:styleId="753">
     <w:name w:val="Grid Table 7 Colorful - Accent 2"/>
-    <w:basedOn w:val="11"/>
+    <w:basedOn w:val="701"/>
     <w:uiPriority w:val="99"/>
     <w:pPr>
       <w:pBdr/>
@@ -13044,11 +13337,11 @@
         <w:tblBorders/>
       </w:tblPr>
       <w:tcPr>
-        <w:shd w:color="ffffff"/>
+        <w:shd w:val="clear" w:color="ffffff"/>
         <w:tcBorders>
-          <w:top w:val="none"/>
-          <w:left w:val="none"/>
-          <w:bottom w:val="none"/>
+          <w:top w:val="none" w:color="000000" w:sz="4" w:space="0"/>
+          <w:left w:val="none" w:color="000000" w:sz="4" w:space="0"/>
+          <w:bottom w:val="none" w:color="000000" w:sz="4" w:space="0"/>
           <w:right w:val="single" w:color="000000" w:themeColor="accent2" w:themeTint="97" w:sz="4" w:space="0"/>
         </w:tcBorders>
       </w:tcPr>
@@ -13071,10 +13364,10 @@
       <w:tcPr>
         <w:shd w:val="clear" w:color="ffffff" w:themeColor="light1" w:fill="ffffff" w:themeFill="light1"/>
         <w:tcBorders>
-          <w:top w:val="none"/>
-          <w:left w:val="none"/>
+          <w:top w:val="none" w:color="000000" w:sz="4" w:space="0"/>
+          <w:left w:val="none" w:color="000000" w:sz="4" w:space="0"/>
           <w:bottom w:val="single" w:color="000000" w:themeColor="accent2" w:themeTint="97" w:sz="4" w:space="0"/>
-          <w:right w:val="none"/>
+          <w:right w:val="none" w:color="000000" w:sz="4" w:space="0"/>
         </w:tcBorders>
       </w:tcPr>
     </w:tblStylePr>
@@ -13094,12 +13387,12 @@
         <w:tblBorders/>
       </w:tblPr>
       <w:tcPr>
-        <w:shd w:color="ffffff"/>
+        <w:shd w:val="clear" w:color="ffffff"/>
         <w:tcBorders>
-          <w:top w:val="none"/>
+          <w:top w:val="none" w:color="000000" w:sz="4" w:space="0"/>
           <w:left w:val="single" w:color="000000" w:themeColor="accent2" w:themeTint="97" w:sz="4" w:space="0"/>
-          <w:bottom w:val="none"/>
-          <w:right w:val="none"/>
+          <w:bottom w:val="none" w:color="000000" w:sz="4" w:space="0"/>
+          <w:right w:val="none" w:color="000000" w:sz="4" w:space="0"/>
         </w:tcBorders>
       </w:tcPr>
     </w:tblStylePr>
@@ -13122,9 +13415,9 @@
         <w:shd w:val="clear" w:color="ffffff" w:themeColor="light1" w:fill="ffffff" w:themeFill="light1"/>
         <w:tcBorders>
           <w:top w:val="single" w:color="000000" w:themeColor="accent2" w:themeTint="97" w:sz="4" w:space="0"/>
-          <w:left w:val="none"/>
-          <w:bottom w:val="none"/>
-          <w:right w:val="none"/>
+          <w:left w:val="none" w:color="000000" w:sz="4" w:space="0"/>
+          <w:bottom w:val="none" w:color="000000" w:sz="4" w:space="0"/>
+          <w:right w:val="none" w:color="000000" w:sz="4" w:space="0"/>
         </w:tcBorders>
       </w:tcPr>
     </w:tblStylePr>
@@ -13194,9 +13487,9 @@
       </w:tcPr>
     </w:tblStylePr>
   </w:style>
-  <w:style w:type="table" w:styleId="64">
+  <w:style w:type="table" w:styleId="754">
     <w:name w:val="Grid Table 7 Colorful - Accent 3"/>
-    <w:basedOn w:val="11"/>
+    <w:basedOn w:val="701"/>
     <w:uiPriority w:val="99"/>
     <w:pPr>
       <w:pBdr/>
@@ -13298,11 +13591,11 @@
         <w:tblBorders/>
       </w:tblPr>
       <w:tcPr>
-        <w:shd w:color="ffffff"/>
+        <w:shd w:val="clear" w:color="ffffff"/>
         <w:tcBorders>
-          <w:top w:val="none"/>
-          <w:left w:val="none"/>
-          <w:bottom w:val="none"/>
+          <w:top w:val="none" w:color="000000" w:sz="4" w:space="0"/>
+          <w:left w:val="none" w:color="000000" w:sz="4" w:space="0"/>
+          <w:bottom w:val="none" w:color="000000" w:sz="4" w:space="0"/>
           <w:right w:val="single" w:color="000000" w:themeColor="accent3" w:themeTint="FE" w:sz="4" w:space="0"/>
         </w:tcBorders>
       </w:tcPr>
@@ -13325,10 +13618,10 @@
       <w:tcPr>
         <w:shd w:val="clear" w:color="ffffff" w:themeColor="light1" w:fill="ffffff" w:themeFill="light1"/>
         <w:tcBorders>
-          <w:top w:val="none"/>
-          <w:left w:val="none"/>
+          <w:top w:val="none" w:color="000000" w:sz="4" w:space="0"/>
+          <w:left w:val="none" w:color="000000" w:sz="4" w:space="0"/>
           <w:bottom w:val="single" w:color="000000" w:themeColor="accent3" w:themeTint="FE" w:sz="4" w:space="0"/>
-          <w:right w:val="none"/>
+          <w:right w:val="none" w:color="000000" w:sz="4" w:space="0"/>
         </w:tcBorders>
       </w:tcPr>
     </w:tblStylePr>
@@ -13348,12 +13641,12 @@
         <w:tblBorders/>
       </w:tblPr>
       <w:tcPr>
-        <w:shd w:color="ffffff"/>
+        <w:shd w:val="clear" w:color="ffffff"/>
         <w:tcBorders>
-          <w:top w:val="none"/>
+          <w:top w:val="none" w:color="000000" w:sz="4" w:space="0"/>
           <w:left w:val="single" w:color="000000" w:themeColor="accent3" w:themeTint="FE" w:sz="4" w:space="0"/>
-          <w:bottom w:val="none"/>
-          <w:right w:val="none"/>
+          <w:bottom w:val="none" w:color="000000" w:sz="4" w:space="0"/>
+          <w:right w:val="none" w:color="000000" w:sz="4" w:space="0"/>
         </w:tcBorders>
       </w:tcPr>
     </w:tblStylePr>
@@ -13376,9 +13669,9 @@
         <w:shd w:val="clear" w:color="ffffff" w:themeColor="light1" w:fill="ffffff" w:themeFill="light1"/>
         <w:tcBorders>
           <w:top w:val="single" w:color="000000" w:themeColor="accent3" w:themeTint="FE" w:sz="4" w:space="0"/>
-          <w:left w:val="none"/>
-          <w:bottom w:val="none"/>
-          <w:right w:val="none"/>
+          <w:left w:val="none" w:color="000000" w:sz="4" w:space="0"/>
+          <w:bottom w:val="none" w:color="000000" w:sz="4" w:space="0"/>
+          <w:right w:val="none" w:color="000000" w:sz="4" w:space="0"/>
         </w:tcBorders>
       </w:tcPr>
     </w:tblStylePr>
@@ -13448,9 +13741,9 @@
       </w:tcPr>
     </w:tblStylePr>
   </w:style>
-  <w:style w:type="table" w:styleId="65">
+  <w:style w:type="table" w:styleId="755">
     <w:name w:val="Grid Table 7 Colorful - Accent 4"/>
-    <w:basedOn w:val="11"/>
+    <w:basedOn w:val="701"/>
     <w:uiPriority w:val="99"/>
     <w:pPr>
       <w:pBdr/>
@@ -13552,11 +13845,11 @@
         <w:tblBorders/>
       </w:tblPr>
       <w:tcPr>
-        <w:shd w:color="ffffff"/>
+        <w:shd w:val="clear" w:color="ffffff"/>
         <w:tcBorders>
-          <w:top w:val="none"/>
-          <w:left w:val="none"/>
-          <w:bottom w:val="none"/>
+          <w:top w:val="none" w:color="000000" w:sz="4" w:space="0"/>
+          <w:left w:val="none" w:color="000000" w:sz="4" w:space="0"/>
+          <w:bottom w:val="none" w:color="000000" w:sz="4" w:space="0"/>
           <w:right w:val="single" w:color="000000" w:themeColor="accent4" w:themeTint="9A" w:sz="4" w:space="0"/>
         </w:tcBorders>
       </w:tcPr>
@@ -13579,10 +13872,10 @@
       <w:tcPr>
         <w:shd w:val="clear" w:color="ffffff" w:themeColor="light1" w:fill="ffffff" w:themeFill="light1"/>
         <w:tcBorders>
-          <w:top w:val="none"/>
-          <w:left w:val="none"/>
+          <w:top w:val="none" w:color="000000" w:sz="4" w:space="0"/>
+          <w:left w:val="none" w:color="000000" w:sz="4" w:space="0"/>
           <w:bottom w:val="single" w:color="000000" w:themeColor="accent4" w:themeTint="9A" w:sz="4" w:space="0"/>
-          <w:right w:val="none"/>
+          <w:right w:val="none" w:color="000000" w:sz="4" w:space="0"/>
         </w:tcBorders>
       </w:tcPr>
     </w:tblStylePr>
@@ -13602,12 +13895,12 @@
         <w:tblBorders/>
       </w:tblPr>
       <w:tcPr>
-        <w:shd w:color="ffffff"/>
+        <w:shd w:val="clear" w:color="ffffff"/>
         <w:tcBorders>
-          <w:top w:val="none"/>
+          <w:top w:val="none" w:color="000000" w:sz="4" w:space="0"/>
           <w:left w:val="single" w:color="000000" w:themeColor="accent4" w:themeTint="9A" w:sz="4" w:space="0"/>
-          <w:bottom w:val="none"/>
-          <w:right w:val="none"/>
+          <w:bottom w:val="none" w:color="000000" w:sz="4" w:space="0"/>
+          <w:right w:val="none" w:color="000000" w:sz="4" w:space="0"/>
         </w:tcBorders>
       </w:tcPr>
     </w:tblStylePr>
@@ -13630,9 +13923,9 @@
         <w:shd w:val="clear" w:color="ffffff" w:themeColor="light1" w:fill="ffffff" w:themeFill="light1"/>
         <w:tcBorders>
           <w:top w:val="single" w:color="000000" w:themeColor="accent4" w:themeTint="9A" w:sz="4" w:space="0"/>
-          <w:left w:val="none"/>
-          <w:bottom w:val="none"/>
-          <w:right w:val="none"/>
+          <w:left w:val="none" w:color="000000" w:sz="4" w:space="0"/>
+          <w:bottom w:val="none" w:color="000000" w:sz="4" w:space="0"/>
+          <w:right w:val="none" w:color="000000" w:sz="4" w:space="0"/>
         </w:tcBorders>
       </w:tcPr>
     </w:tblStylePr>
@@ -13702,9 +13995,9 @@
       </w:tcPr>
     </w:tblStylePr>
   </w:style>
-  <w:style w:type="table" w:styleId="66">
+  <w:style w:type="table" w:styleId="756">
     <w:name w:val="Grid Table 7 Colorful - Accent 5"/>
-    <w:basedOn w:val="11"/>
+    <w:basedOn w:val="701"/>
     <w:uiPriority w:val="99"/>
     <w:pPr>
       <w:pBdr/>
@@ -13806,11 +14099,11 @@
         <w:tblBorders/>
       </w:tblPr>
       <w:tcPr>
-        <w:shd w:color="ffffff"/>
+        <w:shd w:val="clear" w:color="ffffff"/>
         <w:tcBorders>
-          <w:top w:val="none"/>
-          <w:left w:val="none"/>
-          <w:bottom w:val="none"/>
+          <w:top w:val="none" w:color="000000" w:sz="4" w:space="0"/>
+          <w:left w:val="none" w:color="000000" w:sz="4" w:space="0"/>
+          <w:bottom w:val="none" w:color="000000" w:sz="4" w:space="0"/>
           <w:right w:val="single" w:color="000000" w:themeColor="accent5" w:themeTint="90" w:sz="4" w:space="0"/>
         </w:tcBorders>
       </w:tcPr>
@@ -13833,10 +14126,10 @@
       <w:tcPr>
         <w:shd w:val="clear" w:color="ffffff" w:themeColor="light1" w:fill="ffffff" w:themeFill="light1"/>
         <w:tcBorders>
-          <w:top w:val="none"/>
-          <w:left w:val="none"/>
+          <w:top w:val="none" w:color="000000" w:sz="4" w:space="0"/>
+          <w:left w:val="none" w:color="000000" w:sz="4" w:space="0"/>
           <w:bottom w:val="single" w:color="000000" w:themeColor="accent5" w:themeTint="90" w:sz="4" w:space="0"/>
-          <w:right w:val="none"/>
+          <w:right w:val="none" w:color="000000" w:sz="4" w:space="0"/>
         </w:tcBorders>
       </w:tcPr>
     </w:tblStylePr>
@@ -13856,12 +14149,12 @@
         <w:tblBorders/>
       </w:tblPr>
       <w:tcPr>
-        <w:shd w:color="ffffff"/>
+        <w:shd w:val="clear" w:color="ffffff"/>
         <w:tcBorders>
-          <w:top w:val="none"/>
+          <w:top w:val="none" w:color="000000" w:sz="4" w:space="0"/>
           <w:left w:val="single" w:color="000000" w:themeColor="accent5" w:themeTint="90" w:sz="4" w:space="0"/>
-          <w:bottom w:val="none"/>
-          <w:right w:val="none"/>
+          <w:bottom w:val="none" w:color="000000" w:sz="4" w:space="0"/>
+          <w:right w:val="none" w:color="000000" w:sz="4" w:space="0"/>
         </w:tcBorders>
       </w:tcPr>
     </w:tblStylePr>
@@ -13884,9 +14177,9 @@
         <w:shd w:val="clear" w:color="ffffff" w:themeColor="light1" w:fill="ffffff" w:themeFill="light1"/>
         <w:tcBorders>
           <w:top w:val="single" w:color="000000" w:themeColor="accent5" w:themeTint="90" w:sz="4" w:space="0"/>
-          <w:left w:val="none"/>
-          <w:bottom w:val="none"/>
-          <w:right w:val="none"/>
+          <w:left w:val="none" w:color="000000" w:sz="4" w:space="0"/>
+          <w:bottom w:val="none" w:color="000000" w:sz="4" w:space="0"/>
+          <w:right w:val="none" w:color="000000" w:sz="4" w:space="0"/>
         </w:tcBorders>
       </w:tcPr>
     </w:tblStylePr>
@@ -13956,9 +14249,9 @@
       </w:tcPr>
     </w:tblStylePr>
   </w:style>
-  <w:style w:type="table" w:styleId="67">
+  <w:style w:type="table" w:styleId="757">
     <w:name w:val="Grid Table 7 Colorful - Accent 6"/>
-    <w:basedOn w:val="11"/>
+    <w:basedOn w:val="701"/>
     <w:uiPriority w:val="99"/>
     <w:pPr>
       <w:pBdr/>
@@ -14060,11 +14353,11 @@
         <w:tblBorders/>
       </w:tblPr>
       <w:tcPr>
-        <w:shd w:color="ffffff"/>
+        <w:shd w:val="clear" w:color="ffffff"/>
         <w:tcBorders>
-          <w:top w:val="none"/>
-          <w:left w:val="none"/>
-          <w:bottom w:val="none"/>
+          <w:top w:val="none" w:color="000000" w:sz="4" w:space="0"/>
+          <w:left w:val="none" w:color="000000" w:sz="4" w:space="0"/>
+          <w:bottom w:val="none" w:color="000000" w:sz="4" w:space="0"/>
           <w:right w:val="single" w:color="000000" w:themeColor="accent6" w:themeTint="90" w:sz="4" w:space="0"/>
         </w:tcBorders>
       </w:tcPr>
@@ -14087,10 +14380,10 @@
       <w:tcPr>
         <w:shd w:val="clear" w:color="ffffff" w:themeColor="light1" w:fill="ffffff" w:themeFill="light1"/>
         <w:tcBorders>
-          <w:top w:val="none"/>
-          <w:left w:val="none"/>
+          <w:top w:val="none" w:color="000000" w:sz="4" w:space="0"/>
+          <w:left w:val="none" w:color="000000" w:sz="4" w:space="0"/>
           <w:bottom w:val="single" w:color="000000" w:themeColor="accent6" w:themeTint="90" w:sz="4" w:space="0"/>
-          <w:right w:val="none"/>
+          <w:right w:val="none" w:color="000000" w:sz="4" w:space="0"/>
         </w:tcBorders>
       </w:tcPr>
     </w:tblStylePr>
@@ -14110,12 +14403,12 @@
         <w:tblBorders/>
       </w:tblPr>
       <w:tcPr>
-        <w:shd w:color="ffffff"/>
+        <w:shd w:val="clear" w:color="ffffff"/>
         <w:tcBorders>
-          <w:top w:val="none"/>
+          <w:top w:val="none" w:color="000000" w:sz="4" w:space="0"/>
           <w:left w:val="single" w:color="000000" w:themeColor="accent6" w:themeTint="90" w:sz="4" w:space="0"/>
-          <w:bottom w:val="none"/>
-          <w:right w:val="none"/>
+          <w:bottom w:val="none" w:color="000000" w:sz="4" w:space="0"/>
+          <w:right w:val="none" w:color="000000" w:sz="4" w:space="0"/>
         </w:tcBorders>
       </w:tcPr>
     </w:tblStylePr>
@@ -14138,9 +14431,9 @@
         <w:shd w:val="clear" w:color="ffffff" w:themeColor="light1" w:fill="ffffff" w:themeFill="light1"/>
         <w:tcBorders>
           <w:top w:val="single" w:color="000000" w:themeColor="accent6" w:themeTint="90" w:sz="4" w:space="0"/>
-          <w:left w:val="none"/>
-          <w:bottom w:val="none"/>
-          <w:right w:val="none"/>
+          <w:left w:val="none" w:color="000000" w:sz="4" w:space="0"/>
+          <w:bottom w:val="none" w:color="000000" w:sz="4" w:space="0"/>
+          <w:right w:val="none" w:color="000000" w:sz="4" w:space="0"/>
         </w:tcBorders>
       </w:tcPr>
     </w:tblStylePr>
@@ -14210,9 +14503,9 @@
       </w:tcPr>
     </w:tblStylePr>
   </w:style>
-  <w:style w:type="table" w:styleId="68">
+  <w:style w:type="table" w:styleId="758">
     <w:name w:val="List Table 1 Light"/>
-    <w:basedOn w:val="11"/>
+    <w:basedOn w:val="701"/>
     <w:uiPriority w:val="99"/>
     <w:pPr>
       <w:pBdr/>
@@ -14426,9 +14719,9 @@
       </w:tcPr>
     </w:tblStylePr>
   </w:style>
-  <w:style w:type="table" w:styleId="69">
+  <w:style w:type="table" w:styleId="759">
     <w:name w:val="List Table 1 Light - Accent 1"/>
-    <w:basedOn w:val="11"/>
+    <w:basedOn w:val="701"/>
     <w:uiPriority w:val="99"/>
     <w:pPr>
       <w:pBdr/>
@@ -14642,9 +14935,9 @@
       </w:tcPr>
     </w:tblStylePr>
   </w:style>
-  <w:style w:type="table" w:styleId="70">
+  <w:style w:type="table" w:styleId="760">
     <w:name w:val="List Table 1 Light - Accent 2"/>
-    <w:basedOn w:val="11"/>
+    <w:basedOn w:val="701"/>
     <w:uiPriority w:val="99"/>
     <w:pPr>
       <w:pBdr/>
@@ -14858,9 +15151,9 @@
       </w:tcPr>
     </w:tblStylePr>
   </w:style>
-  <w:style w:type="table" w:styleId="71">
+  <w:style w:type="table" w:styleId="761">
     <w:name w:val="List Table 1 Light - Accent 3"/>
-    <w:basedOn w:val="11"/>
+    <w:basedOn w:val="701"/>
     <w:uiPriority w:val="99"/>
     <w:pPr>
       <w:pBdr/>
@@ -15074,9 +15367,9 @@
       </w:tcPr>
     </w:tblStylePr>
   </w:style>
-  <w:style w:type="table" w:styleId="72">
+  <w:style w:type="table" w:styleId="762">
     <w:name w:val="List Table 1 Light - Accent 4"/>
-    <w:basedOn w:val="11"/>
+    <w:basedOn w:val="701"/>
     <w:uiPriority w:val="99"/>
     <w:pPr>
       <w:pBdr/>
@@ -15290,9 +15583,9 @@
       </w:tcPr>
     </w:tblStylePr>
   </w:style>
-  <w:style w:type="table" w:styleId="73">
+  <w:style w:type="table" w:styleId="763">
     <w:name w:val="List Table 1 Light - Accent 5"/>
-    <w:basedOn w:val="11"/>
+    <w:basedOn w:val="701"/>
     <w:uiPriority w:val="99"/>
     <w:pPr>
       <w:pBdr/>
@@ -15506,9 +15799,9 @@
       </w:tcPr>
     </w:tblStylePr>
   </w:style>
-  <w:style w:type="table" w:styleId="74">
+  <w:style w:type="table" w:styleId="764">
     <w:name w:val="List Table 1 Light - Accent 6"/>
-    <w:basedOn w:val="11"/>
+    <w:basedOn w:val="701"/>
     <w:uiPriority w:val="99"/>
     <w:pPr>
       <w:pBdr/>
@@ -15722,9 +16015,9 @@
       </w:tcPr>
     </w:tblStylePr>
   </w:style>
-  <w:style w:type="table" w:styleId="75">
+  <w:style w:type="table" w:styleId="765">
     <w:name w:val="List Table 2"/>
-    <w:basedOn w:val="11"/>
+    <w:basedOn w:val="701"/>
     <w:uiPriority w:val="99"/>
     <w:pPr>
       <w:pBdr/>
@@ -15960,9 +16253,9 @@
       </w:tcPr>
     </w:tblStylePr>
   </w:style>
-  <w:style w:type="table" w:styleId="76">
+  <w:style w:type="table" w:styleId="766">
     <w:name w:val="List Table 2 - Accent 1"/>
-    <w:basedOn w:val="11"/>
+    <w:basedOn w:val="701"/>
     <w:uiPriority w:val="99"/>
     <w:pPr>
       <w:pBdr/>
@@ -16198,9 +16491,9 @@
       </w:tcPr>
     </w:tblStylePr>
   </w:style>
-  <w:style w:type="table" w:styleId="77">
+  <w:style w:type="table" w:styleId="767">
     <w:name w:val="List Table 2 - Accent 2"/>
-    <w:basedOn w:val="11"/>
+    <w:basedOn w:val="701"/>
     <w:uiPriority w:val="99"/>
     <w:pPr>
       <w:pBdr/>
@@ -16436,9 +16729,9 @@
       </w:tcPr>
     </w:tblStylePr>
   </w:style>
-  <w:style w:type="table" w:styleId="78">
+  <w:style w:type="table" w:styleId="768">
     <w:name w:val="List Table 2 - Accent 3"/>
-    <w:basedOn w:val="11"/>
+    <w:basedOn w:val="701"/>
     <w:uiPriority w:val="99"/>
     <w:pPr>
       <w:pBdr/>
@@ -16674,9 +16967,9 @@
       </w:tcPr>
     </w:tblStylePr>
   </w:style>
-  <w:style w:type="table" w:styleId="79">
+  <w:style w:type="table" w:styleId="769">
     <w:name w:val="List Table 2 - Accent 4"/>
-    <w:basedOn w:val="11"/>
+    <w:basedOn w:val="701"/>
     <w:uiPriority w:val="99"/>
     <w:pPr>
       <w:pBdr/>
@@ -16912,9 +17205,9 @@
       </w:tcPr>
     </w:tblStylePr>
   </w:style>
-  <w:style w:type="table" w:styleId="80">
+  <w:style w:type="table" w:styleId="770">
     <w:name w:val="List Table 2 - Accent 5"/>
-    <w:basedOn w:val="11"/>
+    <w:basedOn w:val="701"/>
     <w:uiPriority w:val="99"/>
     <w:pPr>
       <w:pBdr/>
@@ -17150,9 +17443,9 @@
       </w:tcPr>
     </w:tblStylePr>
   </w:style>
-  <w:style w:type="table" w:styleId="81">
+  <w:style w:type="table" w:styleId="771">
     <w:name w:val="List Table 2 - Accent 6"/>
-    <w:basedOn w:val="11"/>
+    <w:basedOn w:val="701"/>
     <w:uiPriority w:val="99"/>
     <w:pPr>
       <w:pBdr/>
@@ -17388,9 +17681,9 @@
       </w:tcPr>
     </w:tblStylePr>
   </w:style>
-  <w:style w:type="table" w:styleId="82">
+  <w:style w:type="table" w:styleId="772">
     <w:name w:val="List Table 3"/>
-    <w:basedOn w:val="11"/>
+    <w:basedOn w:val="701"/>
     <w:uiPriority w:val="99"/>
     <w:pPr>
       <w:pBdr/>
@@ -17616,9 +17909,9 @@
       </w:tcPr>
     </w:tblStylePr>
   </w:style>
-  <w:style w:type="table" w:styleId="83">
+  <w:style w:type="table" w:styleId="773">
     <w:name w:val="List Table 3 - Accent 1"/>
-    <w:basedOn w:val="11"/>
+    <w:basedOn w:val="701"/>
     <w:uiPriority w:val="99"/>
     <w:pPr>
       <w:pBdr/>
@@ -17844,9 +18137,9 @@
       </w:tcPr>
     </w:tblStylePr>
   </w:style>
-  <w:style w:type="table" w:styleId="84">
+  <w:style w:type="table" w:styleId="774">
     <w:name w:val="List Table 3 - Accent 2"/>
-    <w:basedOn w:val="11"/>
+    <w:basedOn w:val="701"/>
     <w:uiPriority w:val="99"/>
     <w:pPr>
       <w:pBdr/>
@@ -18072,9 +18365,9 @@
       </w:tcPr>
     </w:tblStylePr>
   </w:style>
-  <w:style w:type="table" w:styleId="85">
+  <w:style w:type="table" w:styleId="775">
     <w:name w:val="List Table 3 - Accent 3"/>
-    <w:basedOn w:val="11"/>
+    <w:basedOn w:val="701"/>
     <w:uiPriority w:val="99"/>
     <w:pPr>
       <w:pBdr/>
@@ -18300,9 +18593,9 @@
       </w:tcPr>
     </w:tblStylePr>
   </w:style>
-  <w:style w:type="table" w:styleId="86">
+  <w:style w:type="table" w:styleId="776">
     <w:name w:val="List Table 3 - Accent 4"/>
-    <w:basedOn w:val="11"/>
+    <w:basedOn w:val="701"/>
     <w:uiPriority w:val="99"/>
     <w:pPr>
       <w:pBdr/>
@@ -18528,9 +18821,9 @@
       </w:tcPr>
     </w:tblStylePr>
   </w:style>
-  <w:style w:type="table" w:styleId="87">
+  <w:style w:type="table" w:styleId="777">
     <w:name w:val="List Table 3 - Accent 5"/>
-    <w:basedOn w:val="11"/>
+    <w:basedOn w:val="701"/>
     <w:uiPriority w:val="99"/>
     <w:pPr>
       <w:pBdr/>
@@ -18756,9 +19049,9 @@
       </w:tcPr>
     </w:tblStylePr>
   </w:style>
-  <w:style w:type="table" w:styleId="88">
+  <w:style w:type="table" w:styleId="778">
     <w:name w:val="List Table 3 - Accent 6"/>
-    <w:basedOn w:val="11"/>
+    <w:basedOn w:val="701"/>
     <w:uiPriority w:val="99"/>
     <w:pPr>
       <w:pBdr/>
@@ -18984,9 +19277,9 @@
       </w:tcPr>
     </w:tblStylePr>
   </w:style>
-  <w:style w:type="table" w:styleId="89">
+  <w:style w:type="table" w:styleId="779">
     <w:name w:val="List Table 4"/>
-    <w:basedOn w:val="11"/>
+    <w:basedOn w:val="701"/>
     <w:uiPriority w:val="99"/>
     <w:pPr>
       <w:pBdr/>
@@ -19209,9 +19502,9 @@
       </w:tcPr>
     </w:tblStylePr>
   </w:style>
-  <w:style w:type="table" w:styleId="90">
+  <w:style w:type="table" w:styleId="780">
     <w:name w:val="List Table 4 - Accent 1"/>
-    <w:basedOn w:val="11"/>
+    <w:basedOn w:val="701"/>
     <w:uiPriority w:val="99"/>
     <w:pPr>
       <w:pBdr/>
@@ -19434,9 +19727,9 @@
       </w:tcPr>
     </w:tblStylePr>
   </w:style>
-  <w:style w:type="table" w:styleId="91">
+  <w:style w:type="table" w:styleId="781">
     <w:name w:val="List Table 4 - Accent 2"/>
-    <w:basedOn w:val="11"/>
+    <w:basedOn w:val="701"/>
     <w:uiPriority w:val="99"/>
     <w:pPr>
       <w:pBdr/>
@@ -19659,9 +19952,9 @@
       </w:tcPr>
     </w:tblStylePr>
   </w:style>
-  <w:style w:type="table" w:styleId="92">
+  <w:style w:type="table" w:styleId="782">
     <w:name w:val="List Table 4 - Accent 3"/>
-    <w:basedOn w:val="11"/>
+    <w:basedOn w:val="701"/>
     <w:uiPriority w:val="99"/>
     <w:pPr>
       <w:pBdr/>
@@ -19884,9 +20177,9 @@
       </w:tcPr>
     </w:tblStylePr>
   </w:style>
-  <w:style w:type="table" w:styleId="93">
+  <w:style w:type="table" w:styleId="783">
     <w:name w:val="List Table 4 - Accent 4"/>
-    <w:basedOn w:val="11"/>
+    <w:basedOn w:val="701"/>
     <w:uiPriority w:val="99"/>
     <w:pPr>
       <w:pBdr/>
@@ -20109,9 +20402,9 @@
       </w:tcPr>
     </w:tblStylePr>
   </w:style>
-  <w:style w:type="table" w:styleId="94">
+  <w:style w:type="table" w:styleId="784">
     <w:name w:val="List Table 4 - Accent 5"/>
-    <w:basedOn w:val="11"/>
+    <w:basedOn w:val="701"/>
     <w:uiPriority w:val="99"/>
     <w:pPr>
       <w:pBdr/>
@@ -20334,9 +20627,9 @@
       </w:tcPr>
     </w:tblStylePr>
   </w:style>
-  <w:style w:type="table" w:styleId="95">
+  <w:style w:type="table" w:styleId="785">
     <w:name w:val="List Table 4 - Accent 6"/>
-    <w:basedOn w:val="11"/>
+    <w:basedOn w:val="701"/>
     <w:uiPriority w:val="99"/>
     <w:pPr>
       <w:pBdr/>
@@ -20559,9 +20852,9 @@
       </w:tcPr>
     </w:tblStylePr>
   </w:style>
-  <w:style w:type="table" w:styleId="96">
+  <w:style w:type="table" w:styleId="786">
     <w:name w:val="List Table 5 Dark"/>
-    <w:basedOn w:val="11"/>
+    <w:basedOn w:val="701"/>
     <w:uiPriority w:val="99"/>
     <w:pPr>
       <w:pBdr/>
@@ -20801,9 +21094,9 @@
       </w:tcPr>
     </w:tblStylePr>
   </w:style>
-  <w:style w:type="table" w:styleId="97">
+  <w:style w:type="table" w:styleId="787">
     <w:name w:val="List Table 5 Dark - Accent 1"/>
-    <w:basedOn w:val="11"/>
+    <w:basedOn w:val="701"/>
     <w:uiPriority w:val="99"/>
     <w:pPr>
       <w:pBdr/>
@@ -21043,9 +21336,9 @@
       </w:tcPr>
     </w:tblStylePr>
   </w:style>
-  <w:style w:type="table" w:styleId="98">
+  <w:style w:type="table" w:styleId="788">
     <w:name w:val="List Table 5 Dark - Accent 2"/>
-    <w:basedOn w:val="11"/>
+    <w:basedOn w:val="701"/>
     <w:uiPriority w:val="99"/>
     <w:pPr>
       <w:pBdr/>
@@ -21285,9 +21578,9 @@
       </w:tcPr>
     </w:tblStylePr>
   </w:style>
-  <w:style w:type="table" w:styleId="99">
+  <w:style w:type="table" w:styleId="789">
     <w:name w:val="List Table 5 Dark - Accent 3"/>
-    <w:basedOn w:val="11"/>
+    <w:basedOn w:val="701"/>
     <w:uiPriority w:val="99"/>
     <w:pPr>
       <w:pBdr/>
@@ -21527,9 +21820,9 @@
       </w:tcPr>
     </w:tblStylePr>
   </w:style>
-  <w:style w:type="table" w:styleId="100">
+  <w:style w:type="table" w:styleId="790">
     <w:name w:val="List Table 5 Dark - Accent 4"/>
-    <w:basedOn w:val="11"/>
+    <w:basedOn w:val="701"/>
     <w:uiPriority w:val="99"/>
     <w:pPr>
       <w:pBdr/>
@@ -21769,9 +22062,9 @@
       </w:tcPr>
     </w:tblStylePr>
   </w:style>
-  <w:style w:type="table" w:styleId="101">
+  <w:style w:type="table" w:styleId="791">
     <w:name w:val="List Table 5 Dark - Accent 5"/>
-    <w:basedOn w:val="11"/>
+    <w:basedOn w:val="701"/>
     <w:uiPriority w:val="99"/>
     <w:pPr>
       <w:pBdr/>
@@ -22011,9 +22304,9 @@
       </w:tcPr>
     </w:tblStylePr>
   </w:style>
-  <w:style w:type="table" w:styleId="102">
+  <w:style w:type="table" w:styleId="792">
     <w:name w:val="List Table 5 Dark - Accent 6"/>
-    <w:basedOn w:val="11"/>
+    <w:basedOn w:val="701"/>
     <w:uiPriority w:val="99"/>
     <w:pPr>
       <w:pBdr/>
@@ -22253,9 +22546,9 @@
       </w:tcPr>
     </w:tblStylePr>
   </w:style>
-  <w:style w:type="table" w:styleId="103">
+  <w:style w:type="table" w:styleId="793">
     <w:name w:val="List Table 6 Colorful"/>
-    <w:basedOn w:val="11"/>
+    <w:basedOn w:val="701"/>
     <w:uiPriority w:val="99"/>
     <w:pPr>
       <w:pBdr/>
@@ -22476,9 +22769,9 @@
       </w:tcPr>
     </w:tblStylePr>
   </w:style>
-  <w:style w:type="table" w:styleId="104">
+  <w:style w:type="table" w:styleId="794">
     <w:name w:val="List Table 6 Colorful - Accent 1"/>
-    <w:basedOn w:val="11"/>
+    <w:basedOn w:val="701"/>
     <w:uiPriority w:val="99"/>
     <w:pPr>
       <w:pBdr/>
@@ -22699,9 +22992,9 @@
       </w:tcPr>
     </w:tblStylePr>
   </w:style>
-  <w:style w:type="table" w:styleId="105">
+  <w:style w:type="table" w:styleId="795">
     <w:name w:val="List Table 6 Colorful - Accent 2"/>
-    <w:basedOn w:val="11"/>
+    <w:basedOn w:val="701"/>
     <w:uiPriority w:val="99"/>
     <w:pPr>
       <w:pBdr/>
@@ -22922,9 +23215,9 @@
       </w:tcPr>
     </w:tblStylePr>
   </w:style>
-  <w:style w:type="table" w:styleId="106">
+  <w:style w:type="table" w:styleId="796">
     <w:name w:val="List Table 6 Colorful - Accent 3"/>
-    <w:basedOn w:val="11"/>
+    <w:basedOn w:val="701"/>
     <w:uiPriority w:val="99"/>
     <w:pPr>
       <w:pBdr/>
@@ -23145,9 +23438,9 @@
       </w:tcPr>
     </w:tblStylePr>
   </w:style>
-  <w:style w:type="table" w:styleId="107">
+  <w:style w:type="table" w:styleId="797">
     <w:name w:val="List Table 6 Colorful - Accent 4"/>
-    <w:basedOn w:val="11"/>
+    <w:basedOn w:val="701"/>
     <w:uiPriority w:val="99"/>
     <w:pPr>
       <w:pBdr/>
@@ -23368,9 +23661,9 @@
       </w:tcPr>
     </w:tblStylePr>
   </w:style>
-  <w:style w:type="table" w:styleId="108">
+  <w:style w:type="table" w:styleId="798">
     <w:name w:val="List Table 6 Colorful - Accent 5"/>
-    <w:basedOn w:val="11"/>
+    <w:basedOn w:val="701"/>
     <w:uiPriority w:val="99"/>
     <w:pPr>
       <w:pBdr/>
@@ -23591,9 +23884,9 @@
       </w:tcPr>
     </w:tblStylePr>
   </w:style>
-  <w:style w:type="table" w:styleId="109">
+  <w:style w:type="table" w:styleId="799">
     <w:name w:val="List Table 6 Colorful - Accent 6"/>
-    <w:basedOn w:val="11"/>
+    <w:basedOn w:val="701"/>
     <w:uiPriority w:val="99"/>
     <w:pPr>
       <w:pBdr/>
@@ -23814,9 +24107,9 @@
       </w:tcPr>
     </w:tblStylePr>
   </w:style>
-  <w:style w:type="table" w:styleId="110">
+  <w:style w:type="table" w:styleId="800">
     <w:name w:val="List Table 7 Colorful"/>
-    <w:basedOn w:val="11"/>
+    <w:basedOn w:val="701"/>
     <w:uiPriority w:val="99"/>
     <w:pPr>
       <w:pBdr/>
@@ -23915,11 +24208,11 @@
         <w:tblBorders/>
       </w:tblPr>
       <w:tcPr>
-        <w:shd w:color="ffffff"/>
+        <w:shd w:val="clear" w:color="ffffff"/>
         <w:tcBorders>
-          <w:top w:val="none"/>
-          <w:left w:val="none"/>
-          <w:bottom w:val="none"/>
+          <w:top w:val="none" w:color="000000" w:sz="4" w:space="0"/>
+          <w:left w:val="none" w:color="000000" w:sz="4" w:space="0"/>
+          <w:bottom w:val="none" w:color="000000" w:sz="4" w:space="0"/>
           <w:right w:val="single" w:color="000000" w:themeColor="text1" w:themeTint="80" w:sz="4" w:space="0"/>
         </w:tcBorders>
       </w:tcPr>
@@ -23942,10 +24235,10 @@
       <w:tcPr>
         <w:shd w:val="clear" w:color="ffffff" w:themeColor="light1" w:fill="ffffff" w:themeFill="light1"/>
         <w:tcBorders>
-          <w:top w:val="none"/>
-          <w:left w:val="none"/>
+          <w:top w:val="none" w:color="000000" w:sz="4" w:space="0"/>
+          <w:left w:val="none" w:color="000000" w:sz="4" w:space="0"/>
           <w:bottom w:val="single" w:color="000000" w:themeColor="text1" w:themeTint="80" w:sz="4" w:space="0"/>
-          <w:right w:val="none"/>
+          <w:right w:val="none" w:color="000000" w:sz="4" w:space="0"/>
         </w:tcBorders>
       </w:tcPr>
     </w:tblStylePr>
@@ -23965,12 +24258,12 @@
         <w:tblBorders/>
       </w:tblPr>
       <w:tcPr>
-        <w:shd w:color="ffffff"/>
+        <w:shd w:val="clear" w:color="ffffff"/>
         <w:tcBorders>
-          <w:top w:val="none"/>
+          <w:top w:val="none" w:color="000000" w:sz="4" w:space="0"/>
           <w:left w:val="single" w:color="000000" w:themeColor="text1" w:themeTint="80" w:sz="4" w:space="0"/>
-          <w:bottom w:val="none"/>
-          <w:right w:val="none"/>
+          <w:bottom w:val="none" w:color="000000" w:sz="4" w:space="0"/>
+          <w:right w:val="none" w:color="000000" w:sz="4" w:space="0"/>
         </w:tcBorders>
       </w:tcPr>
     </w:tblStylePr>
@@ -23993,9 +24286,9 @@
         <w:shd w:val="clear" w:color="ffffff" w:themeColor="light1" w:fill="ffffff" w:themeFill="light1"/>
         <w:tcBorders>
           <w:top w:val="single" w:color="000000" w:themeColor="text1" w:themeTint="80" w:sz="4" w:space="0"/>
-          <w:left w:val="none"/>
-          <w:bottom w:val="none"/>
-          <w:right w:val="none"/>
+          <w:left w:val="none" w:color="000000" w:sz="4" w:space="0"/>
+          <w:bottom w:val="none" w:color="000000" w:sz="4" w:space="0"/>
+          <w:right w:val="none" w:color="000000" w:sz="4" w:space="0"/>
         </w:tcBorders>
       </w:tcPr>
     </w:tblStylePr>
@@ -24070,9 +24363,9 @@
       </w:tcPr>
     </w:tblStylePr>
   </w:style>
-  <w:style w:type="table" w:styleId="111">
+  <w:style w:type="table" w:styleId="801">
     <w:name w:val="List Table 7 Colorful - Accent 1"/>
-    <w:basedOn w:val="11"/>
+    <w:basedOn w:val="701"/>
     <w:uiPriority w:val="99"/>
     <w:pPr>
       <w:pBdr/>
@@ -24171,11 +24464,11 @@
         <w:tblBorders/>
       </w:tblPr>
       <w:tcPr>
-        <w:shd w:color="ffffff"/>
+        <w:shd w:val="clear" w:color="ffffff"/>
         <w:tcBorders>
-          <w:top w:val="none"/>
-          <w:left w:val="none"/>
-          <w:bottom w:val="none"/>
+          <w:top w:val="none" w:color="000000" w:sz="4" w:space="0"/>
+          <w:left w:val="none" w:color="000000" w:sz="4" w:space="0"/>
+          <w:bottom w:val="none" w:color="000000" w:sz="4" w:space="0"/>
           <w:right w:val="single" w:color="000000" w:themeColor="accent1" w:sz="4" w:space="0"/>
         </w:tcBorders>
       </w:tcPr>
@@ -24198,10 +24491,10 @@
       <w:tcPr>
         <w:shd w:val="clear" w:color="ffffff" w:themeColor="light1" w:fill="ffffff" w:themeFill="light1"/>
         <w:tcBorders>
-          <w:top w:val="none"/>
-          <w:left w:val="none"/>
+          <w:top w:val="none" w:color="000000" w:sz="4" w:space="0"/>
+          <w:left w:val="none" w:color="000000" w:sz="4" w:space="0"/>
           <w:bottom w:val="single" w:color="000000" w:themeColor="accent1" w:sz="4" w:space="0"/>
-          <w:right w:val="none"/>
+          <w:right w:val="none" w:color="000000" w:sz="4" w:space="0"/>
         </w:tcBorders>
       </w:tcPr>
     </w:tblStylePr>
@@ -24221,12 +24514,12 @@
         <w:tblBorders/>
       </w:tblPr>
       <w:tcPr>
-        <w:shd w:color="ffffff"/>
+        <w:shd w:val="clear" w:color="ffffff"/>
         <w:tcBorders>
-          <w:top w:val="none"/>
+          <w:top w:val="none" w:color="000000" w:sz="4" w:space="0"/>
           <w:left w:val="single" w:color="000000" w:themeColor="accent1" w:sz="4" w:space="0"/>
-          <w:bottom w:val="none"/>
-          <w:right w:val="none"/>
+          <w:bottom w:val="none" w:color="000000" w:sz="4" w:space="0"/>
+          <w:right w:val="none" w:color="000000" w:sz="4" w:space="0"/>
         </w:tcBorders>
       </w:tcPr>
     </w:tblStylePr>
@@ -24249,9 +24542,9 @@
         <w:shd w:val="clear" w:color="ffffff" w:themeColor="light1" w:fill="ffffff" w:themeFill="light1"/>
         <w:tcBorders>
           <w:top w:val="single" w:color="000000" w:themeColor="accent1" w:sz="4" w:space="0"/>
-          <w:left w:val="none"/>
-          <w:bottom w:val="none"/>
-          <w:right w:val="none"/>
+          <w:left w:val="none" w:color="000000" w:sz="4" w:space="0"/>
+          <w:bottom w:val="none" w:color="000000" w:sz="4" w:space="0"/>
+          <w:right w:val="none" w:color="000000" w:sz="4" w:space="0"/>
         </w:tcBorders>
       </w:tcPr>
     </w:tblStylePr>
@@ -24326,9 +24619,9 @@
       </w:tcPr>
     </w:tblStylePr>
   </w:style>
-  <w:style w:type="table" w:styleId="112">
+  <w:style w:type="table" w:styleId="802">
     <w:name w:val="List Table 7 Colorful - Accent 2"/>
-    <w:basedOn w:val="11"/>
+    <w:basedOn w:val="701"/>
     <w:uiPriority w:val="99"/>
     <w:pPr>
       <w:pBdr/>
@@ -24427,11 +24720,11 @@
         <w:tblBorders/>
       </w:tblPr>
       <w:tcPr>
-        <w:shd w:color="ffffff"/>
+        <w:shd w:val="clear" w:color="ffffff"/>
         <w:tcBorders>
-          <w:top w:val="none"/>
-          <w:left w:val="none"/>
-          <w:bottom w:val="none"/>
+          <w:top w:val="none" w:color="000000" w:sz="4" w:space="0"/>
+          <w:left w:val="none" w:color="000000" w:sz="4" w:space="0"/>
+          <w:bottom w:val="none" w:color="000000" w:sz="4" w:space="0"/>
           <w:right w:val="single" w:color="000000" w:themeColor="accent2" w:themeTint="97" w:sz="4" w:space="0"/>
         </w:tcBorders>
       </w:tcPr>
@@ -24454,10 +24747,10 @@
       <w:tcPr>
         <w:shd w:val="clear" w:color="ffffff" w:themeColor="light1" w:fill="ffffff" w:themeFill="light1"/>
         <w:tcBorders>
-          <w:top w:val="none"/>
-          <w:left w:val="none"/>
+          <w:top w:val="none" w:color="000000" w:sz="4" w:space="0"/>
+          <w:left w:val="none" w:color="000000" w:sz="4" w:space="0"/>
           <w:bottom w:val="single" w:color="000000" w:themeColor="accent2" w:themeTint="97" w:sz="4" w:space="0"/>
-          <w:right w:val="none"/>
+          <w:right w:val="none" w:color="000000" w:sz="4" w:space="0"/>
         </w:tcBorders>
       </w:tcPr>
     </w:tblStylePr>
@@ -24477,12 +24770,12 @@
         <w:tblBorders/>
       </w:tblPr>
       <w:tcPr>
-        <w:shd w:color="ffffff"/>
+        <w:shd w:val="clear" w:color="ffffff"/>
         <w:tcBorders>
-          <w:top w:val="none"/>
+          <w:top w:val="none" w:color="000000" w:sz="4" w:space="0"/>
           <w:left w:val="single" w:color="000000" w:themeColor="accent2" w:themeTint="97" w:sz="4" w:space="0"/>
-          <w:bottom w:val="none"/>
-          <w:right w:val="none"/>
+          <w:bottom w:val="none" w:color="000000" w:sz="4" w:space="0"/>
+          <w:right w:val="none" w:color="000000" w:sz="4" w:space="0"/>
         </w:tcBorders>
       </w:tcPr>
     </w:tblStylePr>
@@ -24505,9 +24798,9 @@
         <w:shd w:val="clear" w:color="ffffff" w:themeColor="light1" w:fill="ffffff" w:themeFill="light1"/>
         <w:tcBorders>
           <w:top w:val="single" w:color="000000" w:themeColor="accent2" w:themeTint="97" w:sz="4" w:space="0"/>
-          <w:left w:val="none"/>
-          <w:bottom w:val="none"/>
-          <w:right w:val="none"/>
+          <w:left w:val="none" w:color="000000" w:sz="4" w:space="0"/>
+          <w:bottom w:val="none" w:color="000000" w:sz="4" w:space="0"/>
+          <w:right w:val="none" w:color="000000" w:sz="4" w:space="0"/>
         </w:tcBorders>
       </w:tcPr>
     </w:tblStylePr>
@@ -24582,9 +24875,9 @@
       </w:tcPr>
     </w:tblStylePr>
   </w:style>
-  <w:style w:type="table" w:styleId="113">
+  <w:style w:type="table" w:styleId="803">
     <w:name w:val="List Table 7 Colorful - Accent 3"/>
-    <w:basedOn w:val="11"/>
+    <w:basedOn w:val="701"/>
     <w:uiPriority w:val="99"/>
     <w:pPr>
       <w:pBdr/>
@@ -24683,11 +24976,11 @@
         <w:tblBorders/>
       </w:tblPr>
       <w:tcPr>
-        <w:shd w:color="ffffff"/>
+        <w:shd w:val="clear" w:color="ffffff"/>
         <w:tcBorders>
-          <w:top w:val="none"/>
-          <w:left w:val="none"/>
-          <w:bottom w:val="none"/>
+          <w:top w:val="none" w:color="000000" w:sz="4" w:space="0"/>
+          <w:left w:val="none" w:color="000000" w:sz="4" w:space="0"/>
+          <w:bottom w:val="none" w:color="000000" w:sz="4" w:space="0"/>
           <w:right w:val="single" w:color="000000" w:themeColor="accent3" w:themeTint="98" w:sz="4" w:space="0"/>
         </w:tcBorders>
       </w:tcPr>
@@ -24710,10 +25003,10 @@
       <w:tcPr>
         <w:shd w:val="clear" w:color="ffffff" w:themeColor="light1" w:fill="ffffff" w:themeFill="light1"/>
         <w:tcBorders>
-          <w:top w:val="none"/>
-          <w:left w:val="none"/>
+          <w:top w:val="none" w:color="000000" w:sz="4" w:space="0"/>
+          <w:left w:val="none" w:color="000000" w:sz="4" w:space="0"/>
           <w:bottom w:val="single" w:color="000000" w:themeColor="accent3" w:themeTint="98" w:sz="4" w:space="0"/>
-          <w:right w:val="none"/>
+          <w:right w:val="none" w:color="000000" w:sz="4" w:space="0"/>
         </w:tcBorders>
       </w:tcPr>
     </w:tblStylePr>
@@ -24733,12 +25026,12 @@
         <w:tblBorders/>
       </w:tblPr>
       <w:tcPr>
-        <w:shd w:color="ffffff"/>
+        <w:shd w:val="clear" w:color="ffffff"/>
         <w:tcBorders>
-          <w:top w:val="none"/>
+          <w:top w:val="none" w:color="000000" w:sz="4" w:space="0"/>
           <w:left w:val="single" w:color="000000" w:themeColor="accent3" w:themeTint="98" w:sz="4" w:space="0"/>
-          <w:bottom w:val="none"/>
-          <w:right w:val="none"/>
+          <w:bottom w:val="none" w:color="000000" w:sz="4" w:space="0"/>
+          <w:right w:val="none" w:color="000000" w:sz="4" w:space="0"/>
         </w:tcBorders>
       </w:tcPr>
     </w:tblStylePr>
@@ -24761,9 +25054,9 @@
         <w:shd w:val="clear" w:color="ffffff" w:themeColor="light1" w:fill="ffffff" w:themeFill="light1"/>
         <w:tcBorders>
           <w:top w:val="single" w:color="000000" w:themeColor="accent3" w:themeTint="98" w:sz="4" w:space="0"/>
-          <w:left w:val="none"/>
-          <w:bottom w:val="none"/>
-          <w:right w:val="none"/>
+          <w:left w:val="none" w:color="000000" w:sz="4" w:space="0"/>
+          <w:bottom w:val="none" w:color="000000" w:sz="4" w:space="0"/>
+          <w:right w:val="none" w:color="000000" w:sz="4" w:space="0"/>
         </w:tcBorders>
       </w:tcPr>
     </w:tblStylePr>
@@ -24838,9 +25131,9 @@
       </w:tcPr>
     </w:tblStylePr>
   </w:style>
-  <w:style w:type="table" w:styleId="114">
+  <w:style w:type="table" w:styleId="804">
     <w:name w:val="List Table 7 Colorful - Accent 4"/>
-    <w:basedOn w:val="11"/>
+    <w:basedOn w:val="701"/>
     <w:uiPriority w:val="99"/>
     <w:pPr>
       <w:pBdr/>
@@ -24939,11 +25232,11 @@
         <w:tblBorders/>
       </w:tblPr>
       <w:tcPr>
-        <w:shd w:color="ffffff"/>
+        <w:shd w:val="clear" w:color="ffffff"/>
         <w:tcBorders>
-          <w:top w:val="none"/>
-          <w:left w:val="none"/>
-          <w:bottom w:val="none"/>
+          <w:top w:val="none" w:color="000000" w:sz="4" w:space="0"/>
+          <w:left w:val="none" w:color="000000" w:sz="4" w:space="0"/>
+          <w:bottom w:val="none" w:color="000000" w:sz="4" w:space="0"/>
           <w:right w:val="single" w:color="000000" w:themeColor="accent4" w:themeTint="9A" w:sz="4" w:space="0"/>
         </w:tcBorders>
       </w:tcPr>
@@ -24966,10 +25259,10 @@
       <w:tcPr>
         <w:shd w:val="clear" w:color="ffffff" w:themeColor="light1" w:fill="ffffff" w:themeFill="light1"/>
         <w:tcBorders>
-          <w:top w:val="none"/>
-          <w:left w:val="none"/>
+          <w:top w:val="none" w:color="000000" w:sz="4" w:space="0"/>
+          <w:left w:val="none" w:color="000000" w:sz="4" w:space="0"/>
           <w:bottom w:val="single" w:color="000000" w:themeColor="accent4" w:themeTint="9A" w:sz="4" w:space="0"/>
-          <w:right w:val="none"/>
+          <w:right w:val="none" w:color="000000" w:sz="4" w:space="0"/>
         </w:tcBorders>
       </w:tcPr>
     </w:tblStylePr>
@@ -24989,12 +25282,12 @@
         <w:tblBorders/>
       </w:tblPr>
       <w:tcPr>
-        <w:shd w:color="ffffff"/>
+        <w:shd w:val="clear" w:color="ffffff"/>
         <w:tcBorders>
-          <w:top w:val="none"/>
+          <w:top w:val="none" w:color="000000" w:sz="4" w:space="0"/>
           <w:left w:val="single" w:color="000000" w:themeColor="accent4" w:themeTint="9A" w:sz="4" w:space="0"/>
-          <w:bottom w:val="none"/>
-          <w:right w:val="none"/>
+          <w:bottom w:val="none" w:color="000000" w:sz="4" w:space="0"/>
+          <w:right w:val="none" w:color="000000" w:sz="4" w:space="0"/>
         </w:tcBorders>
       </w:tcPr>
     </w:tblStylePr>
@@ -25017,9 +25310,9 @@
         <w:shd w:val="clear" w:color="ffffff" w:themeColor="light1" w:fill="ffffff" w:themeFill="light1"/>
         <w:tcBorders>
           <w:top w:val="single" w:color="000000" w:themeColor="accent4" w:themeTint="9A" w:sz="4" w:space="0"/>
-          <w:left w:val="none"/>
-          <w:bottom w:val="none"/>
-          <w:right w:val="none"/>
+          <w:left w:val="none" w:color="000000" w:sz="4" w:space="0"/>
+          <w:bottom w:val="none" w:color="000000" w:sz="4" w:space="0"/>
+          <w:right w:val="none" w:color="000000" w:sz="4" w:space="0"/>
         </w:tcBorders>
       </w:tcPr>
     </w:tblStylePr>
@@ -25094,9 +25387,9 @@
       </w:tcPr>
     </w:tblStylePr>
   </w:style>
-  <w:style w:type="table" w:styleId="115">
+  <w:style w:type="table" w:styleId="805">
     <w:name w:val="List Table 7 Colorful - Accent 5"/>
-    <w:basedOn w:val="11"/>
+    <w:basedOn w:val="701"/>
     <w:uiPriority w:val="99"/>
     <w:pPr>
       <w:pBdr/>
@@ -25195,11 +25488,11 @@
         <w:tblBorders/>
       </w:tblPr>
       <w:tcPr>
-        <w:shd w:color="ffffff"/>
+        <w:shd w:val="clear" w:color="ffffff"/>
         <w:tcBorders>
-          <w:top w:val="none"/>
-          <w:left w:val="none"/>
-          <w:bottom w:val="none"/>
+          <w:top w:val="none" w:color="000000" w:sz="4" w:space="0"/>
+          <w:left w:val="none" w:color="000000" w:sz="4" w:space="0"/>
+          <w:bottom w:val="none" w:color="000000" w:sz="4" w:space="0"/>
           <w:right w:val="single" w:color="000000" w:themeColor="accent5" w:themeTint="9A" w:sz="4" w:space="0"/>
         </w:tcBorders>
       </w:tcPr>
@@ -25222,10 +25515,10 @@
       <w:tcPr>
         <w:shd w:val="clear" w:color="ffffff" w:themeColor="light1" w:fill="ffffff" w:themeFill="light1"/>
         <w:tcBorders>
-          <w:top w:val="none"/>
-          <w:left w:val="none"/>
+          <w:top w:val="none" w:color="000000" w:sz="4" w:space="0"/>
+          <w:left w:val="none" w:color="000000" w:sz="4" w:space="0"/>
           <w:bottom w:val="single" w:color="000000" w:themeColor="accent5" w:themeTint="9A" w:sz="4" w:space="0"/>
-          <w:right w:val="none"/>
+          <w:right w:val="none" w:color="000000" w:sz="4" w:space="0"/>
         </w:tcBorders>
       </w:tcPr>
     </w:tblStylePr>
@@ -25245,12 +25538,12 @@
         <w:tblBorders/>
       </w:tblPr>
       <w:tcPr>
-        <w:shd w:color="ffffff"/>
+        <w:shd w:val="clear" w:color="ffffff"/>
         <w:tcBorders>
-          <w:top w:val="none"/>
+          <w:top w:val="none" w:color="000000" w:sz="4" w:space="0"/>
           <w:left w:val="single" w:color="000000" w:themeColor="accent5" w:themeTint="9A" w:sz="4" w:space="0"/>
-          <w:bottom w:val="none"/>
-          <w:right w:val="none"/>
+          <w:bottom w:val="none" w:color="000000" w:sz="4" w:space="0"/>
+          <w:right w:val="none" w:color="000000" w:sz="4" w:space="0"/>
         </w:tcBorders>
       </w:tcPr>
     </w:tblStylePr>
@@ -25273,9 +25566,9 @@
         <w:shd w:val="clear" w:color="ffffff" w:themeColor="light1" w:fill="ffffff" w:themeFill="light1"/>
         <w:tcBorders>
           <w:top w:val="single" w:color="000000" w:themeColor="accent5" w:themeTint="9A" w:sz="4" w:space="0"/>
-          <w:left w:val="none"/>
-          <w:bottom w:val="none"/>
-          <w:right w:val="none"/>
+          <w:left w:val="none" w:color="000000" w:sz="4" w:space="0"/>
+          <w:bottom w:val="none" w:color="000000" w:sz="4" w:space="0"/>
+          <w:right w:val="none" w:color="000000" w:sz="4" w:space="0"/>
         </w:tcBorders>
       </w:tcPr>
     </w:tblStylePr>
@@ -25350,9 +25643,9 @@
       </w:tcPr>
     </w:tblStylePr>
   </w:style>
-  <w:style w:type="table" w:styleId="116">
+  <w:style w:type="table" w:styleId="806">
     <w:name w:val="List Table 7 Colorful - Accent 6"/>
-    <w:basedOn w:val="11"/>
+    <w:basedOn w:val="701"/>
     <w:uiPriority w:val="99"/>
     <w:pPr>
       <w:pBdr/>
@@ -25451,11 +25744,11 @@
         <w:tblBorders/>
       </w:tblPr>
       <w:tcPr>
-        <w:shd w:color="ffffff"/>
+        <w:shd w:val="clear" w:color="ffffff"/>
         <w:tcBorders>
-          <w:top w:val="none"/>
-          <w:left w:val="none"/>
-          <w:bottom w:val="none"/>
+          <w:top w:val="none" w:color="000000" w:sz="4" w:space="0"/>
+          <w:left w:val="none" w:color="000000" w:sz="4" w:space="0"/>
+          <w:bottom w:val="none" w:color="000000" w:sz="4" w:space="0"/>
           <w:right w:val="single" w:color="000000" w:themeColor="accent6" w:themeTint="98" w:sz="4" w:space="0"/>
         </w:tcBorders>
       </w:tcPr>
@@ -25478,10 +25771,10 @@
       <w:tcPr>
         <w:shd w:val="clear" w:color="ffffff" w:themeColor="light1" w:fill="ffffff" w:themeFill="light1"/>
         <w:tcBorders>
-          <w:top w:val="none"/>
-          <w:left w:val="none"/>
+          <w:top w:val="none" w:color="000000" w:sz="4" w:space="0"/>
+          <w:left w:val="none" w:color="000000" w:sz="4" w:space="0"/>
           <w:bottom w:val="single" w:color="000000" w:themeColor="accent6" w:themeTint="98" w:sz="4" w:space="0"/>
-          <w:right w:val="none"/>
+          <w:right w:val="none" w:color="000000" w:sz="4" w:space="0"/>
         </w:tcBorders>
       </w:tcPr>
     </w:tblStylePr>
@@ -25501,12 +25794,12 @@
         <w:tblBorders/>
       </w:tblPr>
       <w:tcPr>
-        <w:shd w:color="ffffff"/>
+        <w:shd w:val="clear" w:color="ffffff"/>
         <w:tcBorders>
-          <w:top w:val="none"/>
+          <w:top w:val="none" w:color="000000" w:sz="4" w:space="0"/>
           <w:left w:val="single" w:color="000000" w:themeColor="accent6" w:themeTint="98" w:sz="4" w:space="0"/>
-          <w:bottom w:val="none"/>
-          <w:right w:val="none"/>
+          <w:bottom w:val="none" w:color="000000" w:sz="4" w:space="0"/>
+          <w:right w:val="none" w:color="000000" w:sz="4" w:space="0"/>
         </w:tcBorders>
       </w:tcPr>
     </w:tblStylePr>
@@ -25529,9 +25822,9 @@
         <w:shd w:val="clear" w:color="ffffff" w:themeColor="light1" w:fill="ffffff" w:themeFill="light1"/>
         <w:tcBorders>
           <w:top w:val="single" w:color="000000" w:themeColor="accent6" w:themeTint="98" w:sz="4" w:space="0"/>
-          <w:left w:val="none"/>
-          <w:bottom w:val="none"/>
-          <w:right w:val="none"/>
+          <w:left w:val="none" w:color="000000" w:sz="4" w:space="0"/>
+          <w:bottom w:val="none" w:color="000000" w:sz="4" w:space="0"/>
+          <w:right w:val="none" w:color="000000" w:sz="4" w:space="0"/>
         </w:tcBorders>
       </w:tcPr>
     </w:tblStylePr>
@@ -25606,9 +25899,9 @@
       </w:tcPr>
     </w:tblStylePr>
   </w:style>
-  <w:style w:type="table" w:styleId="117">
+  <w:style w:type="table" w:styleId="807">
     <w:name w:val="Lined - Accent"/>
-    <w:basedOn w:val="11"/>
+    <w:basedOn w:val="701"/>
     <w:uiPriority w:val="99"/>
     <w:pPr>
       <w:pBdr/>
@@ -25843,9 +26136,9 @@
       </w:tcPr>
     </w:tblStylePr>
   </w:style>
-  <w:style w:type="table" w:styleId="118">
+  <w:style w:type="table" w:styleId="808">
     <w:name w:val="Lined - Accent 1"/>
-    <w:basedOn w:val="11"/>
+    <w:basedOn w:val="701"/>
     <w:uiPriority w:val="99"/>
     <w:pPr>
       <w:pBdr/>
@@ -26080,9 +26373,9 @@
       </w:tcPr>
     </w:tblStylePr>
   </w:style>
-  <w:style w:type="table" w:styleId="119">
+  <w:style w:type="table" w:styleId="809">
     <w:name w:val="Lined - Accent 2"/>
-    <w:basedOn w:val="11"/>
+    <w:basedOn w:val="701"/>
     <w:uiPriority w:val="99"/>
     <w:pPr>
       <w:pBdr/>
@@ -26317,9 +26610,9 @@
       </w:tcPr>
     </w:tblStylePr>
   </w:style>
-  <w:style w:type="table" w:styleId="120">
+  <w:style w:type="table" w:styleId="810">
     <w:name w:val="Lined - Accent 3"/>
-    <w:basedOn w:val="11"/>
+    <w:basedOn w:val="701"/>
     <w:uiPriority w:val="99"/>
     <w:pPr>
       <w:pBdr/>
@@ -26554,9 +26847,9 @@
       </w:tcPr>
     </w:tblStylePr>
   </w:style>
-  <w:style w:type="table" w:styleId="121">
+  <w:style w:type="table" w:styleId="811">
     <w:name w:val="Lined - Accent 4"/>
-    <w:basedOn w:val="11"/>
+    <w:basedOn w:val="701"/>
     <w:uiPriority w:val="99"/>
     <w:pPr>
       <w:pBdr/>
@@ -26791,9 +27084,9 @@
       </w:tcPr>
     </w:tblStylePr>
   </w:style>
-  <w:style w:type="table" w:styleId="122">
+  <w:style w:type="table" w:styleId="812">
     <w:name w:val="Lined - Accent 5"/>
-    <w:basedOn w:val="11"/>
+    <w:basedOn w:val="701"/>
     <w:uiPriority w:val="99"/>
     <w:pPr>
       <w:pBdr/>
@@ -27028,9 +27321,9 @@
       </w:tcPr>
     </w:tblStylePr>
   </w:style>
-  <w:style w:type="table" w:styleId="123">
+  <w:style w:type="table" w:styleId="813">
     <w:name w:val="Lined - Accent 6"/>
-    <w:basedOn w:val="11"/>
+    <w:basedOn w:val="701"/>
     <w:uiPriority w:val="99"/>
     <w:pPr>
       <w:pBdr/>
@@ -27265,9 +27558,9 @@
       </w:tcPr>
     </w:tblStylePr>
   </w:style>
-  <w:style w:type="table" w:styleId="124">
+  <w:style w:type="table" w:styleId="814">
     <w:name w:val="Bordered &amp; Lined - Accent"/>
-    <w:basedOn w:val="11"/>
+    <w:basedOn w:val="701"/>
     <w:uiPriority w:val="99"/>
     <w:pPr>
       <w:pBdr/>
@@ -27509,9 +27802,9 @@
       </w:tcPr>
     </w:tblStylePr>
   </w:style>
-  <w:style w:type="table" w:styleId="125">
+  <w:style w:type="table" w:styleId="815">
     <w:name w:val="Bordered &amp; Lined - Accent 1"/>
-    <w:basedOn w:val="11"/>
+    <w:basedOn w:val="701"/>
     <w:uiPriority w:val="99"/>
     <w:pPr>
       <w:pBdr/>
@@ -27753,9 +28046,9 @@
       </w:tcPr>
     </w:tblStylePr>
   </w:style>
-  <w:style w:type="table" w:styleId="126">
+  <w:style w:type="table" w:styleId="816">
     <w:name w:val="Bordered &amp; Lined - Accent 2"/>
-    <w:basedOn w:val="11"/>
+    <w:basedOn w:val="701"/>
     <w:uiPriority w:val="99"/>
     <w:pPr>
       <w:pBdr/>
@@ -27997,9 +28290,9 @@
       </w:tcPr>
     </w:tblStylePr>
   </w:style>
-  <w:style w:type="table" w:styleId="127">
+  <w:style w:type="table" w:styleId="817">
     <w:name w:val="Bordered &amp; Lined - Accent 3"/>
-    <w:basedOn w:val="11"/>
+    <w:basedOn w:val="701"/>
     <w:uiPriority w:val="99"/>
     <w:pPr>
       <w:pBdr/>
@@ -28241,9 +28534,9 @@
       </w:tcPr>
     </w:tblStylePr>
   </w:style>
-  <w:style w:type="table" w:styleId="128">
+  <w:style w:type="table" w:styleId="818">
     <w:name w:val="Bordered &amp; Lined - Accent 4"/>
-    <w:basedOn w:val="11"/>
+    <w:basedOn w:val="701"/>
     <w:uiPriority w:val="99"/>
     <w:pPr>
       <w:pBdr/>
@@ -28485,9 +28778,9 @@
       </w:tcPr>
     </w:tblStylePr>
   </w:style>
-  <w:style w:type="table" w:styleId="129">
+  <w:style w:type="table" w:styleId="819">
     <w:name w:val="Bordered &amp; Lined - Accent 5"/>
-    <w:basedOn w:val="11"/>
+    <w:basedOn w:val="701"/>
     <w:uiPriority w:val="99"/>
     <w:pPr>
       <w:pBdr/>
@@ -28729,9 +29022,9 @@
       </w:tcPr>
     </w:tblStylePr>
   </w:style>
-  <w:style w:type="table" w:styleId="130">
+  <w:style w:type="table" w:styleId="820">
     <w:name w:val="Bordered &amp; Lined - Accent 6"/>
-    <w:basedOn w:val="11"/>
+    <w:basedOn w:val="701"/>
     <w:uiPriority w:val="99"/>
     <w:pPr>
       <w:pBdr/>
@@ -28973,9 +29266,9 @@
       </w:tcPr>
     </w:tblStylePr>
   </w:style>
-  <w:style w:type="table" w:styleId="131">
+  <w:style w:type="table" w:styleId="821">
     <w:name w:val="Bordered"/>
-    <w:basedOn w:val="11"/>
+    <w:basedOn w:val="701"/>
     <w:uiPriority w:val="99"/>
     <w:pPr>
       <w:pBdr/>
@@ -29204,9 +29497,9 @@
       </w:tcPr>
     </w:tblStylePr>
   </w:style>
-  <w:style w:type="table" w:styleId="132">
+  <w:style w:type="table" w:styleId="822">
     <w:name w:val="Bordered - Accent 1"/>
-    <w:basedOn w:val="11"/>
+    <w:basedOn w:val="701"/>
     <w:uiPriority w:val="99"/>
     <w:pPr>
       <w:pBdr/>
@@ -29435,9 +29728,9 @@
       </w:tcPr>
     </w:tblStylePr>
   </w:style>
-  <w:style w:type="table" w:styleId="133">
+  <w:style w:type="table" w:styleId="823">
     <w:name w:val="Bordered - Accent 2"/>
-    <w:basedOn w:val="11"/>
+    <w:basedOn w:val="701"/>
     <w:uiPriority w:val="99"/>
     <w:pPr>
       <w:pBdr/>
@@ -29666,9 +29959,9 @@
       </w:tcPr>
     </w:tblStylePr>
   </w:style>
-  <w:style w:type="table" w:styleId="134">
+  <w:style w:type="table" w:styleId="824">
     <w:name w:val="Bordered - Accent 3"/>
-    <w:basedOn w:val="11"/>
+    <w:basedOn w:val="701"/>
     <w:uiPriority w:val="99"/>
     <w:pPr>
       <w:pBdr/>
@@ -29897,9 +30190,9 @@
       </w:tcPr>
     </w:tblStylePr>
   </w:style>
-  <w:style w:type="table" w:styleId="135">
+  <w:style w:type="table" w:styleId="825">
     <w:name w:val="Bordered - Accent 4"/>
-    <w:basedOn w:val="11"/>
+    <w:basedOn w:val="701"/>
     <w:uiPriority w:val="99"/>
     <w:pPr>
       <w:pBdr/>
@@ -30128,9 +30421,9 @@
       </w:tcPr>
     </w:tblStylePr>
   </w:style>
-  <w:style w:type="table" w:styleId="136">
+  <w:style w:type="table" w:styleId="826">
     <w:name w:val="Bordered - Accent 5"/>
-    <w:basedOn w:val="11"/>
+    <w:basedOn w:val="701"/>
     <w:uiPriority w:val="99"/>
     <w:pPr>
       <w:pBdr/>
@@ -30359,9 +30652,9 @@
       </w:tcPr>
     </w:tblStylePr>
   </w:style>
-  <w:style w:type="table" w:styleId="137">
+  <w:style w:type="table" w:styleId="827">
     <w:name w:val="Bordered - Accent 6"/>
-    <w:basedOn w:val="11"/>
+    <w:basedOn w:val="701"/>
     <w:uiPriority w:val="99"/>
     <w:pPr>
       <w:pBdr/>
@@ -30590,11 +30883,11 @@
       </w:tcPr>
     </w:tblStylePr>
   </w:style>
-  <w:style w:type="paragraph" w:styleId="139">
+  <w:style w:type="paragraph" w:styleId="828">
     <w:name w:val="Heading 1"/>
-    <w:basedOn w:val="681"/>
-    <w:next w:val="681"/>
-    <w:link w:val="150"/>
+    <w:basedOn w:val="890"/>
+    <w:next w:val="890"/>
+    <w:link w:val="839"/>
     <w:uiPriority w:val="9"/>
     <w:qFormat/>
     <w:pPr>
@@ -30612,11 +30905,11 @@
       <w:szCs w:val="40"/>
     </w:rPr>
   </w:style>
-  <w:style w:type="paragraph" w:styleId="140">
+  <w:style w:type="paragraph" w:styleId="829">
     <w:name w:val="Heading 2"/>
-    <w:basedOn w:val="681"/>
-    <w:next w:val="681"/>
-    <w:link w:val="151"/>
+    <w:basedOn w:val="890"/>
+    <w:next w:val="890"/>
+    <w:link w:val="840"/>
     <w:uiPriority w:val="9"/>
     <w:unhideWhenUsed/>
     <w:qFormat/>
@@ -30635,11 +30928,11 @@
       <w:szCs w:val="32"/>
     </w:rPr>
   </w:style>
-  <w:style w:type="paragraph" w:styleId="141">
+  <w:style w:type="paragraph" w:styleId="830">
     <w:name w:val="Heading 3"/>
-    <w:basedOn w:val="681"/>
-    <w:next w:val="681"/>
-    <w:link w:val="152"/>
+    <w:basedOn w:val="890"/>
+    <w:next w:val="890"/>
+    <w:link w:val="841"/>
     <w:uiPriority w:val="9"/>
     <w:unhideWhenUsed/>
     <w:qFormat/>
@@ -30658,11 +30951,11 @@
       <w:szCs w:val="28"/>
     </w:rPr>
   </w:style>
-  <w:style w:type="paragraph" w:styleId="142">
+  <w:style w:type="paragraph" w:styleId="831">
     <w:name w:val="Heading 4"/>
-    <w:basedOn w:val="681"/>
-    <w:next w:val="681"/>
-    <w:link w:val="153"/>
+    <w:basedOn w:val="890"/>
+    <w:next w:val="890"/>
+    <w:link w:val="842"/>
     <w:uiPriority w:val="9"/>
     <w:unhideWhenUsed/>
     <w:qFormat/>
@@ -30681,11 +30974,11 @@
       <w:color w:val="0f4761" w:themeColor="accent1" w:themeShade="BF"/>
     </w:rPr>
   </w:style>
-  <w:style w:type="paragraph" w:styleId="143">
+  <w:style w:type="paragraph" w:styleId="832">
     <w:name w:val="Heading 5"/>
-    <w:basedOn w:val="681"/>
-    <w:next w:val="681"/>
-    <w:link w:val="154"/>
+    <w:basedOn w:val="890"/>
+    <w:next w:val="890"/>
+    <w:link w:val="843"/>
     <w:uiPriority w:val="9"/>
     <w:unhideWhenUsed/>
     <w:qFormat/>
@@ -30702,11 +30995,11 @@
       <w:color w:val="0f4761" w:themeColor="accent1" w:themeShade="BF"/>
     </w:rPr>
   </w:style>
-  <w:style w:type="paragraph" w:styleId="144">
+  <w:style w:type="paragraph" w:styleId="833">
     <w:name w:val="Heading 6"/>
-    <w:basedOn w:val="681"/>
-    <w:next w:val="681"/>
-    <w:link w:val="155"/>
+    <w:basedOn w:val="890"/>
+    <w:next w:val="890"/>
+    <w:link w:val="844"/>
     <w:uiPriority w:val="9"/>
     <w:unhideWhenUsed/>
     <w:qFormat/>
@@ -30725,11 +31018,11 @@
       <w:color w:val="595959" w:themeColor="text1" w:themeTint="A6"/>
     </w:rPr>
   </w:style>
-  <w:style w:type="paragraph" w:styleId="145">
+  <w:style w:type="paragraph" w:styleId="834">
     <w:name w:val="Heading 7"/>
-    <w:basedOn w:val="681"/>
-    <w:next w:val="681"/>
-    <w:link w:val="156"/>
+    <w:basedOn w:val="890"/>
+    <w:next w:val="890"/>
+    <w:link w:val="845"/>
     <w:uiPriority w:val="9"/>
     <w:unhideWhenUsed/>
     <w:qFormat/>
@@ -30746,11 +31039,11 @@
       <w:color w:val="595959" w:themeColor="text1" w:themeTint="A6"/>
     </w:rPr>
   </w:style>
-  <w:style w:type="paragraph" w:styleId="146">
+  <w:style w:type="paragraph" w:styleId="835">
     <w:name w:val="Heading 8"/>
-    <w:basedOn w:val="681"/>
-    <w:next w:val="681"/>
-    <w:link w:val="157"/>
+    <w:basedOn w:val="890"/>
+    <w:next w:val="890"/>
+    <w:link w:val="846"/>
     <w:uiPriority w:val="9"/>
     <w:unhideWhenUsed/>
     <w:qFormat/>
@@ -30769,11 +31062,11 @@
       <w:color w:val="272727" w:themeColor="text1" w:themeTint="D8"/>
     </w:rPr>
   </w:style>
-  <w:style w:type="paragraph" w:styleId="147">
+  <w:style w:type="paragraph" w:styleId="836">
     <w:name w:val="Heading 9"/>
-    <w:basedOn w:val="681"/>
-    <w:next w:val="681"/>
-    <w:link w:val="158"/>
+    <w:basedOn w:val="890"/>
+    <w:next w:val="890"/>
+    <w:link w:val="847"/>
     <w:uiPriority w:val="9"/>
     <w:unhideWhenUsed/>
     <w:qFormat/>
@@ -30792,7 +31085,7 @@
       <w:color w:val="272727" w:themeColor="text1" w:themeTint="D8"/>
     </w:rPr>
   </w:style>
-  <w:style w:type="character" w:styleId="148" w:default="1">
+  <w:style w:type="character" w:styleId="837" w:default="1">
     <w:name w:val="Default Paragraph Font"/>
     <w:uiPriority w:val="1"/>
     <w:semiHidden/>
@@ -30803,7 +31096,7 @@
       <w:ind/>
     </w:pPr>
   </w:style>
-  <w:style w:type="numbering" w:styleId="149" w:default="1">
+  <w:style w:type="numbering" w:styleId="838" w:default="1">
     <w:name w:val="No List"/>
     <w:uiPriority w:val="99"/>
     <w:semiHidden/>
@@ -30814,10 +31107,10 @@
       <w:ind/>
     </w:pPr>
   </w:style>
-  <w:style w:type="character" w:styleId="150">
+  <w:style w:type="character" w:styleId="839">
     <w:name w:val="Heading 1 Char"/>
-    <w:basedOn w:val="148"/>
-    <w:link w:val="139"/>
+    <w:basedOn w:val="837"/>
+    <w:link w:val="828"/>
     <w:uiPriority w:val="9"/>
     <w:pPr>
       <w:pBdr/>
@@ -30831,10 +31124,10 @@
       <w:szCs w:val="40"/>
     </w:rPr>
   </w:style>
-  <w:style w:type="character" w:styleId="151">
+  <w:style w:type="character" w:styleId="840">
     <w:name w:val="Heading 2 Char"/>
-    <w:basedOn w:val="148"/>
-    <w:link w:val="140"/>
+    <w:basedOn w:val="837"/>
+    <w:link w:val="829"/>
     <w:uiPriority w:val="9"/>
     <w:pPr>
       <w:pBdr/>
@@ -30848,10 +31141,10 @@
       <w:szCs w:val="32"/>
     </w:rPr>
   </w:style>
-  <w:style w:type="character" w:styleId="152">
+  <w:style w:type="character" w:styleId="841">
     <w:name w:val="Heading 3 Char"/>
-    <w:basedOn w:val="148"/>
-    <w:link w:val="141"/>
+    <w:basedOn w:val="837"/>
+    <w:link w:val="830"/>
     <w:uiPriority w:val="9"/>
     <w:pPr>
       <w:pBdr/>
@@ -30865,10 +31158,10 @@
       <w:szCs w:val="28"/>
     </w:rPr>
   </w:style>
-  <w:style w:type="character" w:styleId="153">
+  <w:style w:type="character" w:styleId="842">
     <w:name w:val="Heading 4 Char"/>
-    <w:basedOn w:val="148"/>
-    <w:link w:val="142"/>
+    <w:basedOn w:val="837"/>
+    <w:link w:val="831"/>
     <w:uiPriority w:val="9"/>
     <w:pPr>
       <w:pBdr/>
@@ -30882,10 +31175,10 @@
       <w:color w:val="0f4761" w:themeColor="accent1" w:themeShade="BF"/>
     </w:rPr>
   </w:style>
-  <w:style w:type="character" w:styleId="154">
+  <w:style w:type="character" w:styleId="843">
     <w:name w:val="Heading 5 Char"/>
-    <w:basedOn w:val="148"/>
-    <w:link w:val="143"/>
+    <w:basedOn w:val="837"/>
+    <w:link w:val="832"/>
     <w:uiPriority w:val="9"/>
     <w:pPr>
       <w:pBdr/>
@@ -30897,10 +31190,10 @@
       <w:color w:val="0f4761" w:themeColor="accent1" w:themeShade="BF"/>
     </w:rPr>
   </w:style>
-  <w:style w:type="character" w:styleId="155">
+  <w:style w:type="character" w:styleId="844">
     <w:name w:val="Heading 6 Char"/>
-    <w:basedOn w:val="148"/>
-    <w:link w:val="144"/>
+    <w:basedOn w:val="837"/>
+    <w:link w:val="833"/>
     <w:uiPriority w:val="9"/>
     <w:pPr>
       <w:pBdr/>
@@ -30914,10 +31207,10 @@
       <w:color w:val="595959" w:themeColor="text1" w:themeTint="A6"/>
     </w:rPr>
   </w:style>
-  <w:style w:type="character" w:styleId="156">
+  <w:style w:type="character" w:styleId="845">
     <w:name w:val="Heading 7 Char"/>
-    <w:basedOn w:val="148"/>
-    <w:link w:val="145"/>
+    <w:basedOn w:val="837"/>
+    <w:link w:val="834"/>
     <w:uiPriority w:val="9"/>
     <w:pPr>
       <w:pBdr/>
@@ -30929,10 +31222,10 @@
       <w:color w:val="595959" w:themeColor="text1" w:themeTint="A6"/>
     </w:rPr>
   </w:style>
-  <w:style w:type="character" w:styleId="157">
+  <w:style w:type="character" w:styleId="846">
     <w:name w:val="Heading 8 Char"/>
-    <w:basedOn w:val="148"/>
-    <w:link w:val="146"/>
+    <w:basedOn w:val="837"/>
+    <w:link w:val="835"/>
     <w:uiPriority w:val="9"/>
     <w:pPr>
       <w:pBdr/>
@@ -30946,10 +31239,10 @@
       <w:color w:val="272727" w:themeColor="text1" w:themeTint="D8"/>
     </w:rPr>
   </w:style>
-  <w:style w:type="character" w:styleId="158">
+  <w:style w:type="character" w:styleId="847">
     <w:name w:val="Heading 9 Char"/>
-    <w:basedOn w:val="148"/>
-    <w:link w:val="147"/>
+    <w:basedOn w:val="837"/>
+    <w:link w:val="836"/>
     <w:uiPriority w:val="9"/>
     <w:pPr>
       <w:pBdr/>
@@ -30963,11 +31256,11 @@
       <w:color w:val="272727" w:themeColor="text1" w:themeTint="D8"/>
     </w:rPr>
   </w:style>
-  <w:style w:type="paragraph" w:styleId="159">
+  <w:style w:type="paragraph" w:styleId="848">
     <w:name w:val="Title"/>
-    <w:basedOn w:val="681"/>
-    <w:next w:val="681"/>
-    <w:link w:val="160"/>
+    <w:basedOn w:val="890"/>
+    <w:next w:val="890"/>
+    <w:link w:val="849"/>
     <w:uiPriority w:val="10"/>
     <w:qFormat/>
     <w:pPr>
@@ -30983,10 +31276,10 @@
       <w:szCs w:val="56"/>
     </w:rPr>
   </w:style>
-  <w:style w:type="character" w:styleId="160">
+  <w:style w:type="character" w:styleId="849">
     <w:name w:val="Title Char"/>
-    <w:basedOn w:val="148"/>
-    <w:link w:val="159"/>
+    <w:basedOn w:val="837"/>
+    <w:link w:val="848"/>
     <w:uiPriority w:val="10"/>
     <w:pPr>
       <w:pBdr/>
@@ -31000,11 +31293,11 @@
       <w:szCs w:val="56"/>
     </w:rPr>
   </w:style>
-  <w:style w:type="paragraph" w:styleId="161">
+  <w:style w:type="paragraph" w:styleId="850">
     <w:name w:val="Subtitle"/>
-    <w:basedOn w:val="681"/>
-    <w:next w:val="681"/>
-    <w:link w:val="162"/>
+    <w:basedOn w:val="890"/>
+    <w:next w:val="890"/>
+    <w:link w:val="851"/>
     <w:uiPriority w:val="11"/>
     <w:qFormat/>
     <w:pPr>
@@ -31022,10 +31315,10 @@
       <w:szCs w:val="28"/>
     </w:rPr>
   </w:style>
-  <w:style w:type="character" w:styleId="162">
+  <w:style w:type="character" w:styleId="851">
     <w:name w:val="Subtitle Char"/>
-    <w:basedOn w:val="148"/>
-    <w:link w:val="161"/>
+    <w:basedOn w:val="837"/>
+    <w:link w:val="850"/>
     <w:uiPriority w:val="11"/>
     <w:pPr>
       <w:pBdr/>
@@ -31039,11 +31332,11 @@
       <w:szCs w:val="28"/>
     </w:rPr>
   </w:style>
-  <w:style w:type="paragraph" w:styleId="163">
+  <w:style w:type="paragraph" w:styleId="852">
     <w:name w:val="Quote"/>
-    <w:basedOn w:val="681"/>
-    <w:next w:val="681"/>
-    <w:link w:val="164"/>
+    <w:basedOn w:val="890"/>
+    <w:next w:val="890"/>
+    <w:link w:val="853"/>
     <w:uiPriority w:val="29"/>
     <w:qFormat/>
     <w:pPr>
@@ -31058,10 +31351,10 @@
       <w:color w:val="404040" w:themeColor="text1" w:themeTint="BF"/>
     </w:rPr>
   </w:style>
-  <w:style w:type="character" w:styleId="164">
+  <w:style w:type="character" w:styleId="853">
     <w:name w:val="Quote Char"/>
-    <w:basedOn w:val="148"/>
-    <w:link w:val="163"/>
+    <w:basedOn w:val="837"/>
+    <w:link w:val="852"/>
     <w:uiPriority w:val="29"/>
     <w:pPr>
       <w:pBdr/>
@@ -31074,9 +31367,9 @@
       <w:color w:val="404040" w:themeColor="text1" w:themeTint="BF"/>
     </w:rPr>
   </w:style>
-  <w:style w:type="paragraph" w:styleId="165">
+  <w:style w:type="paragraph" w:styleId="854">
     <w:name w:val="List Paragraph"/>
-    <w:basedOn w:val="681"/>
+    <w:basedOn w:val="890"/>
     <w:uiPriority w:val="34"/>
     <w:qFormat/>
     <w:pPr>
@@ -31086,9 +31379,9 @@
       <w:contextualSpacing w:val="true"/>
     </w:pPr>
   </w:style>
-  <w:style w:type="character" w:styleId="166">
+  <w:style w:type="character" w:styleId="855">
     <w:name w:val="Intense Emphasis"/>
-    <w:basedOn w:val="148"/>
+    <w:basedOn w:val="837"/>
     <w:uiPriority w:val="21"/>
     <w:qFormat/>
     <w:pPr>
@@ -31102,11 +31395,11 @@
       <w:color w:val="0f4761" w:themeColor="accent1" w:themeShade="BF"/>
     </w:rPr>
   </w:style>
-  <w:style w:type="paragraph" w:styleId="167">
+  <w:style w:type="paragraph" w:styleId="856">
     <w:name w:val="Intense Quote"/>
-    <w:basedOn w:val="681"/>
-    <w:next w:val="681"/>
-    <w:link w:val="168"/>
+    <w:basedOn w:val="890"/>
+    <w:next w:val="890"/>
+    <w:link w:val="857"/>
     <w:uiPriority w:val="30"/>
     <w:qFormat/>
     <w:pPr>
@@ -31124,10 +31417,10 @@
       <w:color w:val="0f4761" w:themeColor="accent1" w:themeShade="BF"/>
     </w:rPr>
   </w:style>
-  <w:style w:type="character" w:styleId="168">
+  <w:style w:type="character" w:styleId="857">
     <w:name w:val="Intense Quote Char"/>
-    <w:basedOn w:val="148"/>
-    <w:link w:val="167"/>
+    <w:basedOn w:val="837"/>
+    <w:link w:val="856"/>
     <w:uiPriority w:val="30"/>
     <w:pPr>
       <w:pBdr/>
@@ -31140,9 +31433,9 @@
       <w:color w:val="0f4761" w:themeColor="accent1" w:themeShade="BF"/>
     </w:rPr>
   </w:style>
-  <w:style w:type="character" w:styleId="169">
+  <w:style w:type="character" w:styleId="858">
     <w:name w:val="Intense Reference"/>
-    <w:basedOn w:val="148"/>
+    <w:basedOn w:val="837"/>
     <w:uiPriority w:val="32"/>
     <w:qFormat/>
     <w:pPr>
@@ -31158,9 +31451,9 @@
       <w:spacing w:val="5"/>
     </w:rPr>
   </w:style>
-  <w:style w:type="paragraph" w:styleId="170">
+  <w:style w:type="paragraph" w:styleId="859">
     <w:name w:val="No Spacing"/>
-    <w:basedOn w:val="681"/>
+    <w:basedOn w:val="890"/>
     <w:uiPriority w:val="1"/>
     <w:qFormat/>
     <w:pPr>
@@ -31169,9 +31462,9 @@
       <w:ind/>
     </w:pPr>
   </w:style>
-  <w:style w:type="character" w:styleId="171">
+  <w:style w:type="character" w:styleId="860">
     <w:name w:val="Subtle Emphasis"/>
-    <w:basedOn w:val="148"/>
+    <w:basedOn w:val="837"/>
     <w:uiPriority w:val="19"/>
     <w:qFormat/>
     <w:pPr>
@@ -31185,9 +31478,9 @@
       <w:color w:val="404040" w:themeColor="text1" w:themeTint="BF"/>
     </w:rPr>
   </w:style>
-  <w:style w:type="character" w:styleId="172">
+  <w:style w:type="character" w:styleId="861">
     <w:name w:val="Emphasis"/>
-    <w:basedOn w:val="148"/>
+    <w:basedOn w:val="837"/>
     <w:uiPriority w:val="20"/>
     <w:qFormat/>
     <w:pPr>
@@ -31200,9 +31493,9 @@
       <w:iCs/>
     </w:rPr>
   </w:style>
-  <w:style w:type="character" w:styleId="173">
+  <w:style w:type="character" w:styleId="862">
     <w:name w:val="Strong"/>
-    <w:basedOn w:val="148"/>
+    <w:basedOn w:val="837"/>
     <w:uiPriority w:val="22"/>
     <w:qFormat/>
     <w:pPr>
@@ -31215,9 +31508,9 @@
       <w:bCs/>
     </w:rPr>
   </w:style>
-  <w:style w:type="character" w:styleId="174">
+  <w:style w:type="character" w:styleId="863">
     <w:name w:val="Subtle Reference"/>
-    <w:basedOn w:val="148"/>
+    <w:basedOn w:val="837"/>
     <w:uiPriority w:val="31"/>
     <w:qFormat/>
     <w:pPr>
@@ -31230,9 +31523,9 @@
       <w:color w:val="5a5a5a" w:themeColor="text1" w:themeTint="A5"/>
     </w:rPr>
   </w:style>
-  <w:style w:type="character" w:styleId="175">
+  <w:style w:type="character" w:styleId="864">
     <w:name w:val="Book Title"/>
-    <w:basedOn w:val="148"/>
+    <w:basedOn w:val="837"/>
     <w:uiPriority w:val="33"/>
     <w:qFormat/>
     <w:pPr>
@@ -31248,10 +31541,10 @@
       <w:spacing w:val="5"/>
     </w:rPr>
   </w:style>
-  <w:style w:type="paragraph" w:styleId="176">
+  <w:style w:type="paragraph" w:styleId="865">
     <w:name w:val="Header"/>
-    <w:basedOn w:val="681"/>
-    <w:link w:val="177"/>
+    <w:basedOn w:val="890"/>
+    <w:link w:val="866"/>
     <w:uiPriority w:val="99"/>
     <w:unhideWhenUsed/>
     <w:pPr>
@@ -31264,10 +31557,10 @@
       <w:ind/>
     </w:pPr>
   </w:style>
-  <w:style w:type="character" w:styleId="177">
+  <w:style w:type="character" w:styleId="866">
     <w:name w:val="Header Char"/>
-    <w:basedOn w:val="148"/>
-    <w:link w:val="176"/>
+    <w:basedOn w:val="837"/>
+    <w:link w:val="865"/>
     <w:uiPriority w:val="99"/>
     <w:pPr>
       <w:pBdr/>
@@ -31275,10 +31568,10 @@
       <w:ind/>
     </w:pPr>
   </w:style>
-  <w:style w:type="paragraph" w:styleId="178">
+  <w:style w:type="paragraph" w:styleId="867">
     <w:name w:val="Footer"/>
-    <w:basedOn w:val="681"/>
-    <w:link w:val="179"/>
+    <w:basedOn w:val="890"/>
+    <w:link w:val="868"/>
     <w:uiPriority w:val="99"/>
     <w:unhideWhenUsed/>
     <w:pPr>
@@ -31291,10 +31584,10 @@
       <w:ind/>
     </w:pPr>
   </w:style>
-  <w:style w:type="character" w:styleId="179">
+  <w:style w:type="character" w:styleId="868">
     <w:name w:val="Footer Char"/>
-    <w:basedOn w:val="148"/>
-    <w:link w:val="178"/>
+    <w:basedOn w:val="837"/>
+    <w:link w:val="867"/>
     <w:uiPriority w:val="99"/>
     <w:pPr>
       <w:pBdr/>
@@ -31302,10 +31595,10 @@
       <w:ind/>
     </w:pPr>
   </w:style>
-  <w:style w:type="paragraph" w:styleId="180">
+  <w:style w:type="paragraph" w:styleId="869">
     <w:name w:val="Caption"/>
-    <w:basedOn w:val="681"/>
-    <w:next w:val="681"/>
+    <w:basedOn w:val="890"/>
+    <w:next w:val="890"/>
     <w:uiPriority w:val="35"/>
     <w:unhideWhenUsed/>
     <w:qFormat/>
@@ -31322,10 +31615,10 @@
       <w:szCs w:val="18"/>
     </w:rPr>
   </w:style>
-  <w:style w:type="paragraph" w:styleId="181">
+  <w:style w:type="paragraph" w:styleId="870">
     <w:name w:val="footnote text"/>
-    <w:basedOn w:val="681"/>
-    <w:link w:val="182"/>
+    <w:basedOn w:val="890"/>
+    <w:link w:val="871"/>
     <w:uiPriority w:val="99"/>
     <w:semiHidden/>
     <w:unhideWhenUsed/>
@@ -31339,10 +31632,10 @@
       <w:szCs w:val="20"/>
     </w:rPr>
   </w:style>
-  <w:style w:type="character" w:styleId="182">
+  <w:style w:type="character" w:styleId="871">
     <w:name w:val="Footnote Text Char"/>
-    <w:basedOn w:val="148"/>
-    <w:link w:val="181"/>
+    <w:basedOn w:val="837"/>
+    <w:link w:val="870"/>
     <w:uiPriority w:val="99"/>
     <w:semiHidden/>
     <w:pPr>
@@ -31355,9 +31648,9 @@
       <w:szCs w:val="20"/>
     </w:rPr>
   </w:style>
-  <w:style w:type="character" w:styleId="183">
+  <w:style w:type="character" w:styleId="872">
     <w:name w:val="footnote reference"/>
-    <w:basedOn w:val="148"/>
+    <w:basedOn w:val="837"/>
     <w:uiPriority w:val="99"/>
     <w:semiHidden/>
     <w:unhideWhenUsed/>
@@ -31370,10 +31663,10 @@
       <w:vertAlign w:val="superscript"/>
     </w:rPr>
   </w:style>
-  <w:style w:type="paragraph" w:styleId="184">
+  <w:style w:type="paragraph" w:styleId="873">
     <w:name w:val="endnote text"/>
-    <w:basedOn w:val="681"/>
-    <w:link w:val="185"/>
+    <w:basedOn w:val="890"/>
+    <w:link w:val="874"/>
     <w:uiPriority w:val="99"/>
     <w:semiHidden/>
     <w:unhideWhenUsed/>
@@ -31387,10 +31680,10 @@
       <w:szCs w:val="20"/>
     </w:rPr>
   </w:style>
-  <w:style w:type="character" w:styleId="185">
+  <w:style w:type="character" w:styleId="874">
     <w:name w:val="Endnote Text Char"/>
-    <w:basedOn w:val="148"/>
-    <w:link w:val="184"/>
+    <w:basedOn w:val="837"/>
+    <w:link w:val="873"/>
     <w:uiPriority w:val="99"/>
     <w:semiHidden/>
     <w:pPr>
@@ -31403,9 +31696,9 @@
       <w:szCs w:val="20"/>
     </w:rPr>
   </w:style>
-  <w:style w:type="character" w:styleId="186">
+  <w:style w:type="character" w:styleId="875">
     <w:name w:val="endnote reference"/>
-    <w:basedOn w:val="148"/>
+    <w:basedOn w:val="837"/>
     <w:uiPriority w:val="99"/>
     <w:semiHidden/>
     <w:unhideWhenUsed/>
@@ -31418,9 +31711,9 @@
       <w:vertAlign w:val="superscript"/>
     </w:rPr>
   </w:style>
-  <w:style w:type="character" w:styleId="187">
+  <w:style w:type="character" w:styleId="876">
     <w:name w:val="Hyperlink"/>
-    <w:basedOn w:val="148"/>
+    <w:basedOn w:val="837"/>
     <w:uiPriority w:val="99"/>
     <w:unhideWhenUsed/>
     <w:pPr>
@@ -31433,9 +31726,9 @@
       <w:u w:val="single"/>
     </w:rPr>
   </w:style>
-  <w:style w:type="character" w:styleId="188">
+  <w:style w:type="character" w:styleId="877">
     <w:name w:val="FollowedHyperlink"/>
-    <w:basedOn w:val="148"/>
+    <w:basedOn w:val="837"/>
     <w:uiPriority w:val="99"/>
     <w:semiHidden/>
     <w:unhideWhenUsed/>
@@ -31449,10 +31742,10 @@
       <w:u w:val="single"/>
     </w:rPr>
   </w:style>
-  <w:style w:type="paragraph" w:styleId="189">
+  <w:style w:type="paragraph" w:styleId="878">
     <w:name w:val="toc 1"/>
-    <w:basedOn w:val="681"/>
-    <w:next w:val="681"/>
+    <w:basedOn w:val="890"/>
+    <w:next w:val="890"/>
     <w:uiPriority w:val="39"/>
     <w:unhideWhenUsed/>
     <w:pPr>
@@ -31461,10 +31754,10 @@
       <w:ind/>
     </w:pPr>
   </w:style>
-  <w:style w:type="paragraph" w:styleId="190">
+  <w:style w:type="paragraph" w:styleId="879">
     <w:name w:val="toc 2"/>
-    <w:basedOn w:val="681"/>
-    <w:next w:val="681"/>
+    <w:basedOn w:val="890"/>
+    <w:next w:val="890"/>
     <w:uiPriority w:val="39"/>
     <w:unhideWhenUsed/>
     <w:pPr>
@@ -31473,10 +31766,10 @@
       <w:ind w:left="220"/>
     </w:pPr>
   </w:style>
-  <w:style w:type="paragraph" w:styleId="191">
+  <w:style w:type="paragraph" w:styleId="880">
     <w:name w:val="toc 3"/>
-    <w:basedOn w:val="681"/>
-    <w:next w:val="681"/>
+    <w:basedOn w:val="890"/>
+    <w:next w:val="890"/>
     <w:uiPriority w:val="39"/>
     <w:unhideWhenUsed/>
     <w:pPr>
@@ -31485,10 +31778,10 @@
       <w:ind w:left="440"/>
     </w:pPr>
   </w:style>
-  <w:style w:type="paragraph" w:styleId="192">
+  <w:style w:type="paragraph" w:styleId="881">
     <w:name w:val="toc 4"/>
-    <w:basedOn w:val="681"/>
-    <w:next w:val="681"/>
+    <w:basedOn w:val="890"/>
+    <w:next w:val="890"/>
     <w:uiPriority w:val="39"/>
     <w:unhideWhenUsed/>
     <w:pPr>
@@ -31497,10 +31790,10 @@
       <w:ind w:left="660"/>
     </w:pPr>
   </w:style>
-  <w:style w:type="paragraph" w:styleId="193">
+  <w:style w:type="paragraph" w:styleId="882">
     <w:name w:val="toc 5"/>
-    <w:basedOn w:val="681"/>
-    <w:next w:val="681"/>
+    <w:basedOn w:val="890"/>
+    <w:next w:val="890"/>
     <w:uiPriority w:val="39"/>
     <w:unhideWhenUsed/>
     <w:pPr>
@@ -31509,10 +31802,10 @@
       <w:ind w:left="880"/>
     </w:pPr>
   </w:style>
-  <w:style w:type="paragraph" w:styleId="194">
+  <w:style w:type="paragraph" w:styleId="883">
     <w:name w:val="toc 6"/>
-    <w:basedOn w:val="681"/>
-    <w:next w:val="681"/>
+    <w:basedOn w:val="890"/>
+    <w:next w:val="890"/>
     <w:uiPriority w:val="39"/>
     <w:unhideWhenUsed/>
     <w:pPr>
@@ -31521,10 +31814,10 @@
       <w:ind w:left="1100"/>
     </w:pPr>
   </w:style>
-  <w:style w:type="paragraph" w:styleId="195">
+  <w:style w:type="paragraph" w:styleId="884">
     <w:name w:val="toc 7"/>
-    <w:basedOn w:val="681"/>
-    <w:next w:val="681"/>
+    <w:basedOn w:val="890"/>
+    <w:next w:val="890"/>
     <w:uiPriority w:val="39"/>
     <w:unhideWhenUsed/>
     <w:pPr>
@@ -31533,10 +31826,10 @@
       <w:ind w:left="1320"/>
     </w:pPr>
   </w:style>
-  <w:style w:type="paragraph" w:styleId="196">
+  <w:style w:type="paragraph" w:styleId="885">
     <w:name w:val="toc 8"/>
-    <w:basedOn w:val="681"/>
-    <w:next w:val="681"/>
+    <w:basedOn w:val="890"/>
+    <w:next w:val="890"/>
     <w:uiPriority w:val="39"/>
     <w:unhideWhenUsed/>
     <w:pPr>
@@ -31545,10 +31838,10 @@
       <w:ind w:left="1540"/>
     </w:pPr>
   </w:style>
-  <w:style w:type="paragraph" w:styleId="197">
+  <w:style w:type="paragraph" w:styleId="886">
     <w:name w:val="toc 9"/>
-    <w:basedOn w:val="681"/>
-    <w:next w:val="681"/>
+    <w:basedOn w:val="890"/>
+    <w:next w:val="890"/>
     <w:uiPriority w:val="39"/>
     <w:unhideWhenUsed/>
     <w:pPr>
@@ -31557,9 +31850,9 @@
       <w:ind w:left="1760"/>
     </w:pPr>
   </w:style>
-  <w:style w:type="character" w:styleId="198">
+  <w:style w:type="character" w:styleId="887">
     <w:name w:val="Placeholder Text"/>
-    <w:basedOn w:val="148"/>
+    <w:basedOn w:val="837"/>
     <w:uiPriority w:val="99"/>
     <w:semiHidden/>
     <w:pPr>
@@ -31571,7 +31864,7 @@
       <w:color w:val="666666"/>
     </w:rPr>
   </w:style>
-  <w:style w:type="paragraph" w:styleId="208">
+  <w:style w:type="paragraph" w:styleId="888">
     <w:name w:val="TOC Heading"/>
     <w:uiPriority w:val="39"/>
     <w:unhideWhenUsed/>
@@ -31581,10 +31874,10 @@
       <w:ind/>
     </w:pPr>
   </w:style>
-  <w:style w:type="paragraph" w:styleId="209">
+  <w:style w:type="paragraph" w:styleId="889">
     <w:name w:val="table of figures"/>
-    <w:basedOn w:val="681"/>
-    <w:next w:val="681"/>
+    <w:basedOn w:val="890"/>
+    <w:next w:val="890"/>
     <w:uiPriority w:val="99"/>
     <w:unhideWhenUsed/>
     <w:pPr>
@@ -31593,10 +31886,10 @@
       <w:ind/>
     </w:pPr>
   </w:style>
-  <w:style w:type="paragraph" w:styleId="681" w:default="1">
+  <w:style w:type="paragraph" w:styleId="890" w:default="1">
     <w:name w:val="Normal"/>
-    <w:next w:val="681"/>
-    <w:link w:val="681"/>
+    <w:next w:val="890"/>
+    <w:link w:val="890"/>
     <w:qFormat/>
     <w:pPr>
       <w:widowControl w:val="false"/>
@@ -31612,10 +31905,10 @@
       <w:lang w:val="en-US" w:eastAsia="zh-CN" w:bidi="ar-SA"/>
     </w:rPr>
   </w:style>
-  <w:style w:type="character" w:styleId="682">
+  <w:style w:type="character" w:styleId="891">
     <w:name w:val="默认段落字体"/>
-    <w:next w:val="682"/>
-    <w:link w:val="681"/>
+    <w:next w:val="891"/>
+    <w:link w:val="890"/>
     <w:semiHidden/>
     <w:pPr>
       <w:pBdr/>
@@ -31623,10 +31916,10 @@
       <w:ind/>
     </w:pPr>
   </w:style>
-  <w:style w:type="table" w:styleId="683">
+  <w:style w:type="table" w:styleId="892">
     <w:name w:val="普通表格"/>
-    <w:next w:val="683"/>
-    <w:link w:val="681"/>
+    <w:next w:val="892"/>
+    <w:link w:val="890"/>
     <w:semiHidden/>
     <w:pPr>
       <w:pBdr/>

</xml_diff>